<commit_message>
docs: v41 editada pelo autor e rodada v42 - consumo e registro de decisoes do painel (Figuras 7 e 8)
Co-Authored-By: Claude Opus 5.5 <noreply@anthropic.com>
</commit_message>
<xml_diff>
--- a/Transicao_pre-projeto-para-TCC-Completo_TCC_Iluminacao_SP_v41.docx
+++ b/Transicao_pre-projeto-para-TCC-Completo_TCC_Iluminacao_SP_v41.docx
@@ -320,6 +320,7 @@
         <w:rPr>
           <w:lang w:val="pt-BR"/>
         </w:rPr>
+        <w:lastRenderedPageBreak/>
         <w:t>BRUNO BONAVIGO DACAL – N309EC4</w:t>
       </w:r>
     </w:p>
@@ -594,6 +595,7 @@
           <w:bCs/>
           <w:lang w:val="pt-BR"/>
         </w:rPr>
+        <w:lastRenderedPageBreak/>
         <w:t>RESUMO</w:t>
       </w:r>
     </w:p>
@@ -665,6 +667,7 @@
           <w:bCs/>
           <w:lang w:val="pt-BR"/>
         </w:rPr>
+        <w:lastRenderedPageBreak/>
         <w:t>ABSTRACT</w:t>
       </w:r>
     </w:p>
@@ -721,6 +724,7 @@
           <w:bCs/>
           <w:lang w:val="pt-BR"/>
         </w:rPr>
+        <w:lastRenderedPageBreak/>
         <w:t>LISTA DE QUADROS</w:t>
       </w:r>
     </w:p>
@@ -1205,6 +1209,7 @@
           <w:bCs/>
           <w:lang w:val="pt-BR"/>
         </w:rPr>
+        <w:lastRenderedPageBreak/>
         <w:t>LISTA DE FIGURAS</w:t>
       </w:r>
     </w:p>
@@ -1214,12 +1219,15 @@
           <w:tab w:val="right" w:leader="dot" w:pos="9071"/>
         </w:tabs>
         <w:spacing w:after="100"/>
-      </w:pPr>
-      <w:r>
-        <w:rPr>
-          <w:lang w:val="pt-BR"/>
-        </w:rPr>
-        <w:t xml:space="preserve">Figura 1 – Nó de demonstração montado</w:t>
+        <w:rPr>
+          <w:lang w:val="pt-BR"/>
+        </w:rPr>
+      </w:pPr>
+      <w:r>
+        <w:rPr>
+          <w:lang w:val="pt-BR"/>
+        </w:rPr>
+        <w:t>Figura 1 – Nó de demonstração montado</w:t>
       </w:r>
     </w:p>
     <w:p>
@@ -1228,12 +1236,15 @@
           <w:tab w:val="right" w:leader="dot" w:pos="9071"/>
         </w:tabs>
         <w:spacing w:after="100"/>
-      </w:pPr>
-      <w:r>
-        <w:rPr>
-          <w:lang w:val="pt-BR"/>
-        </w:rPr>
-        <w:t xml:space="preserve">Figura 2 – Interior do anteparo: luminária em uma extremidade e sensor na outra</w:t>
+        <w:rPr>
+          <w:lang w:val="pt-BR"/>
+        </w:rPr>
+      </w:pPr>
+      <w:r>
+        <w:rPr>
+          <w:lang w:val="pt-BR"/>
+        </w:rPr>
+        <w:t>Figura 2 – Interior do anteparo: luminária em uma extremidade e sensor na outra</w:t>
       </w:r>
     </w:p>
     <w:p>
@@ -1250,13 +1261,7 @@
         <w:rPr>
           <w:lang w:val="pt-BR"/>
         </w:rPr>
-        <w:t xml:space="preserve">Figura 3</w:t>
-      </w:r>
-      <w:r>
-        <w:rPr>
-          <w:lang w:val="pt-BR"/>
-        </w:rPr>
-        <w:t xml:space="preserve"> – Arquitetura do sistema</w:t>
+        <w:t>Figura 3 – Arquitetura do sistema</w:t>
       </w:r>
       <w:r>
         <w:rPr>
@@ -1280,13 +1285,7 @@
         <w:rPr>
           <w:lang w:val="pt-BR"/>
         </w:rPr>
-        <w:t xml:space="preserve">Figura 4</w:t>
-      </w:r>
-      <w:r>
-        <w:rPr>
-          <w:lang w:val="pt-BR"/>
-        </w:rPr>
-        <w:t xml:space="preserve"> – Sequência de mensagens de uma decisão</w:t>
+        <w:t>Figura 4 – Sequência de mensagens de uma decisão</w:t>
       </w:r>
     </w:p>
     <w:p>
@@ -1295,12 +1294,15 @@
           <w:tab w:val="right" w:leader="dot" w:pos="9071"/>
         </w:tabs>
         <w:spacing w:after="100"/>
-      </w:pPr>
-      <w:r>
-        <w:rPr>
-          <w:lang w:val="pt-BR"/>
-        </w:rPr>
-        <w:t xml:space="preserve">Figura 5 – Painel de acompanhamento: visão de monitoramento</w:t>
+        <w:rPr>
+          <w:lang w:val="pt-BR"/>
+        </w:rPr>
+      </w:pPr>
+      <w:r>
+        <w:rPr>
+          <w:lang w:val="pt-BR"/>
+        </w:rPr>
+        <w:t>Figura 5 – Painel de acompanhamento: visão de monitoramento</w:t>
       </w:r>
     </w:p>
     <w:p>
@@ -1309,12 +1311,15 @@
           <w:tab w:val="right" w:leader="dot" w:pos="9071"/>
         </w:tabs>
         <w:spacing w:after="100"/>
-      </w:pPr>
-      <w:r>
-        <w:rPr>
-          <w:lang w:val="pt-BR"/>
-        </w:rPr>
-        <w:t xml:space="preserve">Figura 6 – Painel de acompanhamento: decisão explicada regra a regra</w:t>
+        <w:rPr>
+          <w:lang w:val="pt-BR"/>
+        </w:rPr>
+      </w:pPr>
+      <w:r>
+        <w:rPr>
+          <w:lang w:val="pt-BR"/>
+        </w:rPr>
+        <w:t>Figura 6 – Painel de acompanhamento: decisão explicada regra a regra</w:t>
       </w:r>
     </w:p>
     <w:p>
@@ -1331,13 +1336,7 @@
         <w:rPr>
           <w:lang w:val="pt-BR"/>
         </w:rPr>
-        <w:t xml:space="preserve">Figura 7</w:t>
-      </w:r>
-      <w:r>
-        <w:rPr>
-          <w:lang w:val="pt-BR"/>
-        </w:rPr>
-        <w:t xml:space="preserve"> – Diagrama entidade-relacionamento do banco de dados</w:t>
+        <w:t>Figura 7 – Diagrama entidade-relacionamento do banco de dados</w:t>
       </w:r>
       <w:r>
         <w:rPr>
@@ -1353,18 +1352,15 @@
           <w:tab w:val="right" w:leader="dot" w:pos="9071"/>
         </w:tabs>
         <w:spacing w:after="100"/>
-      </w:pPr>
-      <w:r>
-        <w:rPr>
-          <w:lang w:val="pt-BR"/>
-        </w:rPr>
-        <w:t xml:space="preserve">Figura 8</w:t>
-      </w:r>
-      <w:r>
-        <w:rPr>
-          <w:lang w:val="pt-BR"/>
-        </w:rPr>
-        <w:t xml:space="preserve"> – Vista posterior do nó de demonstração</w:t>
+        <w:rPr>
+          <w:lang w:val="pt-BR"/>
+        </w:rPr>
+      </w:pPr>
+      <w:r>
+        <w:rPr>
+          <w:lang w:val="pt-BR"/>
+        </w:rPr>
+        <w:t>Figura 8 – Vista posterior do nó de demonstração</w:t>
       </w:r>
     </w:p>
     <w:p>
@@ -1394,6 +1390,7 @@
           <w:bCs/>
           <w:lang w:val="pt-BR"/>
         </w:rPr>
+        <w:lastRenderedPageBreak/>
         <w:t>LISTA DE TABELAS</w:t>
       </w:r>
     </w:p>
@@ -7193,6 +7190,7 @@
         <w:rPr>
           <w:lang w:val="pt-BR"/>
         </w:rPr>
+        <w:lastRenderedPageBreak/>
         <w:t>1 INTRODUÇÃO</w:t>
       </w:r>
       <w:bookmarkEnd w:id="0"/>
@@ -7341,6 +7339,7 @@
         <w:rPr>
           <w:lang w:val="pt-BR"/>
         </w:rPr>
+        <w:lastRenderedPageBreak/>
         <w:t>O estágio atual dessas iniciativas em São Paulo tem um traço que interessa diretamente a este trabalho: a instrumentação da cidade deixou de ser proposta e passou a ser infraestrutura instalada e contratada. Não se trata, portanto, de propor que a cidade passe a coletar dados ou a controlar remotamente suas luminárias — ambas as coisas já estão contratadas. Trata-se de propor um uso para o que já existe.</w:t>
       </w:r>
     </w:p>
@@ -7461,6 +7460,7 @@
         <w:rPr>
           <w:lang w:val="pt-BR"/>
         </w:rPr>
+        <w:lastRenderedPageBreak/>
         <w:t>incide sobre um fenômeno mensurável, e não sobre o julgamento de qual seria o nível correto de iluminação — julgamento que não dispõe de referência externa e cuja rotulação pelos próprios autores tornaria a avaliação circular.</w:t>
       </w:r>
     </w:p>
@@ -7575,6 +7575,7 @@
         <w:rPr>
           <w:lang w:val="pt-BR"/>
         </w:rPr>
+        <w:lastRenderedPageBreak/>
         <w:t>A iluminação pública não se adapta às variações das condições e da movimentação urbana. Operada em fluxo pleno durante toda a noite, oferece iluminação desnecessariamente elevada em situações de menor demanda. Atenuada por horário fixo, a forma mais simples de reduzir o consumo, pode oferecer iluminação insuficiente quando a via continua ocupada ou quando ocorre um evento que exigiria mais luz.</w:t>
       </w:r>
     </w:p>
@@ -7713,6 +7714,7 @@
         <w:rPr>
           <w:lang w:val="pt-BR"/>
         </w:rPr>
+        <w:lastRenderedPageBreak/>
         <w:t>intensidade de um nó de iluminação pública de forma consistente com as condições observadas, dentro de limite de latência especificado, e sem violar em nenhuma decisão os limites estabelecidos pela ABNT NBR 5101.</w:t>
       </w:r>
     </w:p>
@@ -7910,6 +7912,7 @@
         <w:rPr>
           <w:lang w:val="pt-BR"/>
         </w:rPr>
+        <w:lastRenderedPageBreak/>
         <w:t>Estimar o consumo de energia sob o regime adaptativo — no nó de bancada, a partir da trajetória de ciclo de trabalho registrada, e em luminária de referência derivada dos parâmetros contratuais do parque municipal, a partir do registro de decisões — e compará-lo ao do regime de fluxo pleno constante e ao de um regime de atenuação por horário fixo, sobre a mesma suíte de cenários.</w:t>
       </w:r>
     </w:p>
@@ -8013,6 +8016,7 @@
         <w:rPr>
           <w:lang w:val="pt-BR"/>
         </w:rPr>
+        <w:lastRenderedPageBreak/>
         <w:t>conflito, e precisam ser compostas numa saída única. O trabalho implementa essa composição por inferência nebulosa e a confronta com uma tabela de decisão com as mesmas regras (4.6).</w:t>
       </w:r>
     </w:p>
@@ -8094,6 +8098,7 @@
         <w:rPr>
           <w:lang w:val="pt-BR"/>
         </w:rPr>
+        <w:lastRenderedPageBreak/>
         <w:t>Quanto à forma de execução, o trabalho combina pesquisa documental sobre a infraestrutura instalada e sobre os dados abertos municipais, desenvolvimento de protótipo e experimentação em bancada, nos termos de 3.1. O método está descrito no Capítulo 3, e a documentação de engenharia de software que orienta a implementação e o banco de dados, ao final dele, em 3.12 e 3.13.</w:t>
       </w:r>
     </w:p>
@@ -8111,6 +8116,7 @@
         <w:rPr>
           <w:lang w:val="pt-BR"/>
         </w:rPr>
+        <w:lastRenderedPageBreak/>
         <w:t>2 REVISÃO BIBLIOGRÁFICA</w:t>
       </w:r>
       <w:bookmarkEnd w:id="13"/>
@@ -8215,6 +8221,7 @@
         <w:rPr>
           <w:lang w:val="pt-BR"/>
         </w:rPr>
+        <w:lastRenderedPageBreak/>
         <w:t>de publicação, e sim pela vigência, e a edição citada é a que permanece em vigor. Dela não se extrai afirmação sobre o estado da arte da técnica. Fica também fora do recorte o estudo de Shikakura, Morikawa e Nakamura (2003), empregado em 3.9 por ser a fonte localizada pelos autores com valor medido de limiar de percepção de variação de iluminância; dele se extrai apenas esse valor. Normas e especificações técnicas — da ABNT, da ISO/IEC, da ANSI, da OASIS e do consórcio TALQ — e a folha de dados do fabricante do microcontrolador comparecem como fonte do que especificam; os documentos da associação setorial de concessionárias, como fonte de dados do setor; e o relato jornalístico de Perry (2020), apenas como registro do caso descrito em 3.10. De nenhuma dessas fontes se extrai afirmação de desempenho.</w:t>
       </w:r>
     </w:p>
@@ -8296,6 +8303,7 @@
         <w:rPr>
           <w:lang w:val="pt-BR"/>
         </w:rPr>
+        <w:lastRenderedPageBreak/>
         <w:t>Anthony Jnr (2024) conduz revisão sistemática sobre o emprego de interfaces de programação de aplicações na interoperabilidade entre sistemas digitais municipais e aponta os sistemas isolados, sem padronização de interfaces, como obstáculo à integração, e a especificação da interface como o instrumento pelo qual esse isolamento se resolve.</w:t>
       </w:r>
     </w:p>
@@ -8360,6 +8368,7 @@
         <w:rPr>
           <w:lang w:val="pt-BR"/>
         </w:rPr>
+        <w:lastRenderedPageBreak/>
         <w:t>2.3 A infraestrutura instalada no município de São Paulo</w:t>
       </w:r>
       <w:bookmarkEnd w:id="16"/>
@@ -8884,6 +8893,7 @@
                 <w:szCs w:val="20"/>
                 <w:lang w:val="pt-BR"/>
               </w:rPr>
+              <w:lastRenderedPageBreak/>
               <w:t>substituindo o tempo presumido pela medição</w:t>
             </w:r>
           </w:p>
@@ -8910,6 +8920,7 @@
                 <w:szCs w:val="20"/>
                 <w:lang w:val="pt-BR"/>
               </w:rPr>
+              <w:lastRenderedPageBreak/>
               <w:t>Nenhum ato vincula a operação da iluminação a dados de outras plataformas municipais</w:t>
             </w:r>
           </w:p>
@@ -9082,6 +9093,7 @@
         <w:rPr>
           <w:lang w:val="pt-BR"/>
         </w:rPr>
+        <w:lastRenderedPageBreak/>
         <w:t>já é produzido — o que desloca a integração do terreno do desenvolvimento para o da especificação de interface.</w:t>
       </w:r>
     </w:p>
@@ -9178,6 +9190,7 @@
         <w:rPr>
           <w:lang w:val="pt-BR"/>
         </w:rPr>
+        <w:lastRenderedPageBreak/>
         <w:t>2.4 Internet das Coisas e nós embarcados</w:t>
       </w:r>
       <w:bookmarkEnd w:id="17"/>
@@ -9259,6 +9272,7 @@
         <w:rPr>
           <w:lang w:val="pt-BR"/>
         </w:rPr>
+        <w:lastRenderedPageBreak/>
         <w:t>2.5 Requisitos normativos</w:t>
       </w:r>
       <w:bookmarkEnd w:id="18"/>
@@ -9346,6 +9360,7 @@
         <w:rPr>
           <w:lang w:val="pt-BR"/>
         </w:rPr>
+        <w:lastRenderedPageBreak/>
         <w:t>iluminação adaptativa. O emprego de dados do ambiente urbano como entrada da decisão segue, portanto, essa recomendação.</w:t>
       </w:r>
     </w:p>
@@ -9433,6 +9448,7 @@
         <w:rPr>
           <w:lang w:val="pt-BR"/>
         </w:rPr>
+        <w:lastRenderedPageBreak/>
         <w:t>representação sintetiza controladores a partir de conhecimento expresso em linguagem natural, dispensando modelo matemático do processo controlado. Estas duas obras comparecem como atribuição de origem, nos termos da subseção 2.1.</w:t>
       </w:r>
     </w:p>
@@ -9503,6 +9519,7 @@
         <w:rPr>
           <w:lang w:val="pt-BR"/>
         </w:rPr>
+        <w:lastRenderedPageBreak/>
         <w:t>de ser produzidos pelos próprios autores, o que introduziria circularidade: o sistema aprenderia a reproduzir o julgamento de quem o avalia. A inferência nebulosa, derivando suas regras da norma técnica e de critérios de projeto declarados, mantém a base de decisão auditável e livre dessa circularidade.</w:t>
       </w:r>
     </w:p>
@@ -9574,6 +9591,7 @@
         <w:rPr>
           <w:lang w:val="pt-BR"/>
         </w:rPr>
+        <w:lastRenderedPageBreak/>
         <w:t>modelos de árvores entre si; essa comparação foi feita sobre os próprios dados do trabalho (3.6 e 4.1).</w:t>
       </w:r>
     </w:p>
@@ -9677,6 +9695,7 @@
         <w:rPr>
           <w:lang w:val="pt-BR"/>
         </w:rPr>
+        <w:lastRenderedPageBreak/>
         <w:t>da iluminação urbana como problema de otimização distribuída de restrições e o resolve por algoritmos executados em rede de luminárias, com cada ponto negociando seu nível com os vizinhos a partir de variáveis ambientais. A proximidade de finalidade é grande e a diferença é de premissa. Naquele trabalho, cada poste dispõe de sensoriamento local, e a avaliação é conduzida em ambiente simulado: a camada de percepção é uma infraestrutura a implantar. Aqui, a percepção é uma infraestrutura já contratada e em operação, produzida por outro sistema municipal para outra finalidade, e o problema desloca-se do sensoriamento para a integração e a decisão.</w:t>
       </w:r>
     </w:p>
@@ -9725,6 +9744,7 @@
         <w:rPr>
           <w:lang w:val="pt-BR"/>
         </w:rPr>
+        <w:lastRenderedPageBreak/>
         <w:t>No plano das implantações, a referência é a rua Stratumseind, em Eindhoven, onde dados de câmeras e de sensores acústicos alimentaram perfis que acionavam cenários dinâmicos de iluminação (GALIC; GELLERT, 2021). Este último é o precedente mais próximo de um laço fechado entre plataforma urbana e iluminação, e três diferenças o separam desta proposta: sua finalidade é comportamental, e não fotométrica; a decisão não é confrontada com classe de iluminação alguma; e a literatura revisada por pares que o documenta é de proteção de dados, e não de arquitetura de sistemas — é precisamente a ausência de garantias que ela critica.</w:t>
       </w:r>
     </w:p>
@@ -9844,6 +9864,7 @@
         <w:rPr>
           <w:lang w:val="pt-BR"/>
         </w:rPr>
+        <w:lastRenderedPageBreak/>
         <w:t>mecanismo, e a interface que o integraria à infraestrutura existente, que o trabalho constrói e avalia.</w:t>
       </w:r>
     </w:p>
@@ -9971,6 +9992,7 @@
         <w:rPr>
           <w:lang w:val="pt-BR"/>
         </w:rPr>
+        <w:lastRenderedPageBreak/>
         <w:t>reduzindo a fração da janela de baixa demanda consumida em transição quando comparada ao acionamento puramente reativo.</w:t>
       </w:r>
     </w:p>
@@ -9988,6 +10010,7 @@
         <w:rPr>
           <w:lang w:val="pt-BR"/>
         </w:rPr>
+        <w:lastRenderedPageBreak/>
         <w:t>3 METODOLOGIA</w:t>
       </w:r>
       <w:bookmarkEnd w:id="24"/>
@@ -10171,6 +10194,7 @@
         <w:rPr>
           <w:lang w:val="pt-BR"/>
         </w:rPr>
+        <w:lastRenderedPageBreak/>
         <w:t>Camada de verificação normativa. Interposta entre a decisão e a atuação, confronta o nível pretendido com o piso extraído da ABNT NBR 5101 e corrige a decisão antes de emiti-la, registrando a correção; a taxa máxima de decréscimo segue com o comando e é aplicada pelo nó (3.7).</w:t>
       </w:r>
     </w:p>
@@ -10271,6 +10295,7 @@
         <w:rPr>
           <w:lang w:val="pt-BR"/>
         </w:rPr>
+        <w:lastRenderedPageBreak/>
         <w:t>A terceira é de governança. Anthony Jnr (2024) aponta os sistemas isolados como obstáculo à integração e identifica na especificação da interface o instrumento pelo qual esse isolamento se resolve. Alojar a lógica de iluminação no contrato de uma plataforma de segurança produziria mais um sistema desse tipo. Acresce que a camada de verificação normativa, para permanecer auditável, precisa ser inspecionável por quem responde pela iluminação pública, condição que não se satisfaz dentro de sistema operado por terceiro sob outro contrato.</w:t>
       </w:r>
     </w:p>
@@ -10287,19 +10312,7 @@
         <w:rPr>
           <w:lang w:val="pt-BR"/>
         </w:rPr>
-        <w:t xml:space="preserve">O serviço de decisão é, por isso, especificado como serviço municipal autônomo: não pertence à plataforma de monitoramento nem ao sistema de telegestão, consome a interface da primeira e comanda o segundo. É essa a posição que a </w:t>
-      </w:r>
-      <w:r>
-        <w:rPr>
-          <w:lang w:val="pt-BR"/>
-        </w:rPr>
-        <w:t xml:space="preserve">Figura 3</w:t>
-      </w:r>
-      <w:r>
-        <w:rPr>
-          <w:lang w:val="pt-BR"/>
-        </w:rPr>
-        <w:t xml:space="preserve"> representa e que a documentação de 3.12 detalha.</w:t>
+        <w:t>O serviço de decisão é, por isso, especificado como serviço municipal autônomo: não pertence à plataforma de monitoramento nem ao sistema de telegestão, consome a interface da primeira e comanda o segundo. É essa a posição que a Figura 3 representa e que a documentação de 3.12 detalha.</w:t>
       </w:r>
     </w:p>
     <w:p>
@@ -11087,6 +11100,7 @@
                 <w:szCs w:val="20"/>
                 <w:lang w:val="pt-BR"/>
               </w:rPr>
+              <w:lastRenderedPageBreak/>
               <w:t>Segmento de fita de LED e módulo de acionamento</w:t>
             </w:r>
           </w:p>
@@ -11511,6 +11525,7 @@
         <w:rPr>
           <w:lang w:val="pt-BR"/>
         </w:rPr>
+        <w:lastRenderedPageBreak/>
         <w:t>tabela de calibração levantada por medição, com interpolação linear entre pontos medidos; no parque, por controlador em tomada normalizada acionando o driver por controle analógico de 0 V a 10 V, com a iluminância resultante conhecida da certificação do produto. Mesma entrada, atuador diferente. É por isso que o que a bancada estabelece a respeito da decisão transpõe-se ao parque sem depender de que o equipamento seja o mesmo.</w:t>
       </w:r>
     </w:p>
@@ -12748,6 +12763,7 @@
                 <w:szCs w:val="20"/>
                 <w:lang w:val="pt-BR"/>
               </w:rPr>
+              <w:lastRenderedPageBreak/>
               <w:t>de 2019, e consolidada em 2022</w:t>
             </w:r>
           </w:p>
@@ -12776,6 +12792,7 @@
                 <w:szCs w:val="20"/>
                 <w:lang w:val="pt-BR"/>
               </w:rPr>
+              <w:lastRenderedPageBreak/>
               <w:t>Verificação da execução e diagnóstico do ativo</w:t>
             </w:r>
           </w:p>
@@ -12921,6 +12938,7 @@
         <w:rPr>
           <w:lang w:val="pt-BR"/>
         </w:rPr>
+        <w:lastRenderedPageBreak/>
         <w:t>3.4 O nó de demonstração</w:t>
       </w:r>
       <w:bookmarkEnd w:id="28"/>
@@ -12938,13 +12956,7 @@
         <w:rPr>
           <w:lang w:val="pt-BR"/>
         </w:rPr>
-        <w:t xml:space="preserve">O protótipo físico é um nó único, deliberadamente mínimo. Sua função no trabalho é tornar visível e mensurável o resultado da decisão, e não caracterizar o comportamento de componentes. </w:t>
-      </w:r>
-      <w:r>
-        <w:rPr>
-          <w:lang w:val="pt-BR"/>
-        </w:rPr>
-        <w:t xml:space="preserve">O Quadro 4 lista seus elementos, e a Figura 1 mostra o nó montado.</w:t>
+        <w:t>O protótipo físico é um nó único, deliberadamente mínimo. Sua função no trabalho é tornar visível e mensurável o resultado da decisão, e não caracterizar o comportamento de componentes. O Quadro 4 lista seus elementos, e a Figura 1 mostra o nó montado.</w:t>
       </w:r>
     </w:p>
     <w:p>
@@ -13666,6 +13678,9 @@
         <w:keepNext/>
         <w:spacing w:before="130" w:after="60"/>
         <w:jc w:val="center"/>
+        <w:rPr>
+          <w:lang w:val="pt-BR"/>
+        </w:rPr>
       </w:pPr>
       <w:r>
         <w:rPr>
@@ -13673,7 +13688,8 @@
           <w:szCs w:val="20"/>
           <w:lang w:val="pt-BR"/>
         </w:rPr>
-        <w:t xml:space="preserve">Figura 1 – Nó de demonstração montado</w:t>
+        <w:lastRenderedPageBreak/>
+        <w:t>Figura 1 – Nó de demonstração montado</w:t>
       </w:r>
     </w:p>
     <w:p>
@@ -13705,7 +13721,7 @@
                     <pic:cNvPicPr/>
                   </pic:nvPicPr>
                   <pic:blipFill>
-                    <a:blip r:embed="rIdFoto104"/>
+                    <a:blip r:embed="rId8"/>
                     <a:stretch>
                       <a:fillRect/>
                     </a:stretch>
@@ -13730,6 +13746,9 @@
       <w:pPr>
         <w:spacing w:after="280"/>
         <w:jc w:val="center"/>
+        <w:rPr>
+          <w:lang w:val="pt-BR"/>
+        </w:rPr>
       </w:pPr>
       <w:r>
         <w:rPr>
@@ -13737,7 +13756,7 @@
           <w:szCs w:val="20"/>
           <w:lang w:val="pt-BR"/>
         </w:rPr>
-        <w:t xml:space="preserve">Fonte: Acervo dos autores (2026).</w:t>
+        <w:t>Fonte: Acervo dos autores (2026).</w:t>
       </w:r>
     </w:p>
     <w:p>
@@ -13753,13 +13772,7 @@
         <w:rPr>
           <w:lang w:val="pt-BR"/>
         </w:rPr>
-        <w:t xml:space="preserve">Todos os elementos são componentes de prateleira, de custo desprezível diante de qualquer ativo urbano, e esse fato integra o argumento: demonstrar o vínculo </w:t>
-      </w:r>
-      <w:r>
-        <w:rPr>
-          <w:lang w:val="pt-BR"/>
-        </w:rPr>
-        <w:t>entre observação urbana e atuação luminosa não requer investimento significativo, o que é coerente com a tese de que o que falta ao município não é equipamento.</w:t>
+        <w:t>Todos os elementos são componentes de prateleira, de custo desprezível diante de qualquer ativo urbano, e esse fato integra o argumento: demonstrar o vínculo entre observação urbana e atuação luminosa não requer investimento significativo, o que é coerente com a tese de que o que falta ao município não é equipamento.</w:t>
       </w:r>
     </w:p>
     <w:p>
@@ -13775,7 +13788,14 @@
         <w:rPr>
           <w:lang w:val="pt-BR"/>
         </w:rPr>
-        <w:t>O comportamento do firmware é fixado por cinco regras. Ao ser energizado, o nó aplica o nível pleno e nele permanece até receber o primeiro comando, de modo que nunca parte apagado. O nível recebido é convertido em ciclo de trabalho pela tabela de calibração descrita em 3.4.4. O comando traz o nível-alvo, a validade, o piso e a taxa máxima de decréscimo da classe; o nó sobe ao alvo na hora e desce até ele em rampa, um passo a cada 5 s, sem ultrapassar a taxa nem ficar abaixo do piso recebidos, que funcionam como segunda barreira à da camada de verificação (3.7). Vencida a validade sem comando novo, o nó assume o nível pleno, conforme o RNF07; a validade acompanha a do volume que sustenta a decisão, de no máximo 15 min (3.5.2). Por fim, a configuração de rede e a credencial do dispositivo residem em arquivo próprio do nó, mantido fora do repositório de código.</w:t>
+        <w:t xml:space="preserve">O comportamento do firmware é fixado por cinco regras. Ao ser energizado, o nó aplica o nível pleno e nele permanece até receber o primeiro comando, de modo que nunca parte apagado. O nível recebido é convertido em ciclo de trabalho pela tabela de calibração descrita em 3.4.4. O comando traz o nível-alvo, a validade, o piso e a taxa máxima de decréscimo da classe; o nó sobe ao alvo na hora e desce até ele em rampa, um passo a cada 5 s, sem ultrapassar a taxa nem ficar abaixo do piso recebidos, que funcionam como segunda barreira à da camada de verificação (3.7). Vencida a validade sem comando novo, o nó assume o nível pleno, conforme o </w:t>
+      </w:r>
+      <w:r>
+        <w:rPr>
+          <w:lang w:val="pt-BR"/>
+        </w:rPr>
+        <w:lastRenderedPageBreak/>
+        <w:t>RNF07; a validade acompanha a do volume que sustenta a decisão, de no máximo 15 min (3.5.2). Por fim, a configuração de rede e a credencial do dispositivo residem em arquivo próprio do nó, mantido fora do repositório de código.</w:t>
       </w:r>
     </w:p>
     <w:p>
@@ -14343,7 +14363,16 @@
                 <w:szCs w:val="20"/>
                 <w:lang w:val="pt-BR"/>
               </w:rPr>
-              <w:t>Emissor de potência em base metálica com resistor de lastro; refletor de estado sólido em 12 V de corrente contínua; luminária viária comercial; lâmpada incandescente com dimerizador</w:t>
+              <w:t xml:space="preserve">Emissor de potência em base metálica com resistor de lastro; refletor de estado sólido em 12 V de corrente contínua; luminária viária comercial; lâmpada </w:t>
+            </w:r>
+            <w:r>
+              <w:rPr>
+                <w:sz w:val="20"/>
+                <w:szCs w:val="20"/>
+                <w:lang w:val="pt-BR"/>
+              </w:rPr>
+              <w:lastRenderedPageBreak/>
+              <w:t>incandescente com dimerizador</w:t>
             </w:r>
           </w:p>
         </w:tc>
@@ -14369,7 +14398,17 @@
                 <w:szCs w:val="20"/>
                 <w:lang w:val="pt-BR"/>
               </w:rPr>
-              <w:t>A fita traz resistores de limitação integrados, o que elimina o cálculo e a dissipação do lastro, dispensa base metálica e reduz a montagem a dois condutores. A objeção usual à fita — a de ser fonte extensa — aplica-se ao rolo, não ao segmento: seis centímetros a 0,44 m subtendem cerca de oito graus, a uma distância superior a sete vezes o comprimento da fonte, e comportam-se como fonte pontual para efeito do cálculo. O refletor de 12 V e a luminária viária têm fluxo muito superior ao necessário para obter 10 lux a menos de meio metro. A lâmpada incandescente não representa a tecnologia instalada no município</w:t>
+              <w:lastRenderedPageBreak/>
+              <w:t xml:space="preserve">A fita traz resistores de limitação integrados, o que elimina o cálculo e a dissipação do lastro, dispensa base metálica e reduz a montagem a dois condutores. A objeção usual à fita — a de ser fonte extensa — aplica-se ao rolo, não ao segmento: seis centímetros a 0,44 m subtendem cerca de oito graus, a uma distância superior a sete vezes o comprimento da fonte, e comportam-se </w:t>
+            </w:r>
+            <w:r>
+              <w:rPr>
+                <w:sz w:val="20"/>
+                <w:szCs w:val="20"/>
+                <w:lang w:val="pt-BR"/>
+              </w:rPr>
+              <w:lastRenderedPageBreak/>
+              <w:t>como fonte pontual para efeito do cálculo. O refletor de 12 V e a luminária viária têm fluxo muito superior ao necessário para obter 10 lux a menos de meio metro. A lâmpada incandescente não representa a tecnologia instalada no município</w:t>
             </w:r>
           </w:p>
         </w:tc>
@@ -14392,6 +14431,7 @@
                 <w:sz w:val="20"/>
                 <w:szCs w:val="20"/>
               </w:rPr>
+              <w:lastRenderedPageBreak/>
               <w:t>Medição</w:t>
             </w:r>
             <w:proofErr w:type="spellEnd"/>
@@ -14634,13 +14674,7 @@
         <w:rPr>
           <w:lang w:val="pt-BR"/>
         </w:rPr>
-        <w:t xml:space="preserve">Duas dessas decisões merecem registro. A primeira é a rejeição do computador de placa única, que não decorre de insuficiência — um computador desse porte executaria com folga tudo o que o nó faz —, e sim de a arquitetura descrita em 3.2 </w:t>
-      </w:r>
-      <w:r>
-        <w:rPr>
-          <w:lang w:val="pt-BR"/>
-        </w:rPr>
-        <w:t>manter a decisão fora do dispositivo: o microcontrolador de recurso restrito é a escolha que torna essa separação verificável, porque o nó não decide por não ter como decidir. Acrescem-se o tempo de inicialização, a suscetibilidade do sistema de arquivos à queda de energia e o custo unitário, relevantes em ativo que se replicaria por centenas de milhares de unidades.</w:t>
+        <w:t>Duas dessas decisões merecem registro. A primeira é a rejeição do computador de placa única, que não decorre de insuficiência — um computador desse porte executaria com folga tudo o que o nó faz —, e sim de a arquitetura descrita em 3.2 manter a decisão fora do dispositivo: o microcontrolador de recurso restrito é a escolha que torna essa separação verificável, porque o nó não decide por não ter como decidir. Acrescem-se o tempo de inicialização, a suscetibilidade do sistema de arquivos à queda de energia e o custo unitário, relevantes em ativo que se replicaria por centenas de milhares de unidades.</w:t>
       </w:r>
     </w:p>
     <w:p>
@@ -14656,7 +14690,14 @@
         <w:rPr>
           <w:lang w:val="pt-BR"/>
         </w:rPr>
-        <w:t>A segunda é a relação entre o acionamento adotado na bancada e o exigido em contrato. O Caderno de Encargos da concessão paulistana, Anexo III do contrato, especifica drivers que permitam dimerização por controle analógico de 0 a 10 V, e a bancada emprega modulação por largura de pulso. As duas são entradas de dimerização padronizadas de reatores de estado sólido, e a conversão entre elas é um filtro passa-baixas seguido de seguidor de tensão. A diferença é, portanto, de interface elétrica e não de natureza do comando: a camada de decisão emite um nível adimensional, e é o nó que o materializa segundo a interface disponível. Registrar isso é o que permite afirmar que o mecanismo demonstrado é transponível ao equipamento efetivamente instalado.</w:t>
+        <w:t xml:space="preserve">A segunda é a relação entre o acionamento adotado na bancada e o exigido em contrato. O Caderno de Encargos da concessão paulistana, Anexo III do contrato, especifica drivers que permitam dimerização por controle analógico de 0 a 10 V, e a bancada emprega modulação por largura de pulso. As duas são entradas de dimerização padronizadas de reatores de estado sólido, e a conversão entre elas é um filtro passa-baixas seguido de seguidor de tensão. A diferença é, portanto, de </w:t>
+      </w:r>
+      <w:r>
+        <w:rPr>
+          <w:lang w:val="pt-BR"/>
+        </w:rPr>
+        <w:lastRenderedPageBreak/>
+        <w:t>interface elétrica e não de natureza do comando: a camada de decisão emite um nível adimensional, e é o nó que o materializa segundo a interface disponível. Registrar isso é o que permite afirmar que o mecanismo demonstrado é transponível ao equipamento efetivamente instalado.</w:t>
       </w:r>
     </w:p>
     <w:p>
@@ -14741,13 +14782,7 @@
         <w:rPr>
           <w:lang w:val="pt-BR"/>
         </w:rPr>
-        <w:t xml:space="preserve"> o ângulo sólido correspondente ao ângulo de abertura declarado </w:t>
-      </w:r>
-      <w:r>
-        <w:rPr>
-          <w:lang w:val="pt-BR"/>
-        </w:rPr>
-        <w:t>pelo fabricante e h a distância ao plano de medição. Fixada a distância, o comprimento do segmento é a variável de projeto.</w:t>
+        <w:t xml:space="preserve"> o ângulo sólido correspondente ao ângulo de abertura declarado pelo fabricante e h a distância ao plano de medição. Fixada a distância, o comprimento do segmento é a variável de projeto.</w:t>
       </w:r>
     </w:p>
     <w:p>
@@ -14763,7 +14798,14 @@
         <w:rPr>
           <w:lang w:val="pt-BR"/>
         </w:rPr>
-        <w:t>Aqui se impõe uma cautela. A especificação elétrica dessas fitas é consistente entre fornecedores — sessenta emissores por metro, 14,4 W/m —, mas a fotométrica não: anúncios de produtos nominalmente idênticos declaram fluxos divergentes entre si. Nenhum desses valores é verificável pelos autores. O comprimento do segmento é, por isso, determinado por medição, e não por catálogo: parte-se de um trecho e ajusta-se o comprimento, em múltiplos do intervalo de seccionamento, até que a leitura a ciclo de trabalho pleno se situe entre uma vez e meia e duas vezes a iluminância média mantida da classe adotada. Quando o menor segmento admitido pelo seccionamento já excede o critério, interpõe-se um difusor entre o segmento e o plano de medição, e é a atenuação do difusor, e não o comprimento, que se ajusta. Foi o que ocorreu na bancada: na primeira montagem, três emissores a 0,44 m produziram 42,6 lux sem difusor, mais de quatro vezes o valor da classe. Na caixa atual, que substituiu a primeira em 10 de outubro de 2026, a primeira leitura com o difusor deu 2,05 vezes o valor da classe; ajustado o difusor, a leitura a ciclo de trabalho pleno ficou em 1,57 vez.</w:t>
+        <w:t xml:space="preserve">Aqui se impõe uma cautela. A especificação elétrica dessas fitas é consistente entre fornecedores — sessenta emissores por metro, 14,4 W/m —, mas a fotométrica não: anúncios de produtos nominalmente idênticos declaram fluxos divergentes entre si. Nenhum desses valores é verificável pelos autores. O comprimento do segmento é, por isso, determinado por medição, e não por catálogo: parte-se de um trecho e ajusta-se o comprimento, em múltiplos do intervalo de seccionamento, até que a leitura a ciclo de trabalho pleno se situe entre uma vez e meia e duas vezes a iluminância média mantida da classe adotada. Quando o menor segmento admitido pelo seccionamento já excede o critério, interpõe-se um difusor entre o segmento e o plano de medição, e é a atenuação do difusor, e não o comprimento, que se ajusta. </w:t>
+      </w:r>
+      <w:r>
+        <w:rPr>
+          <w:lang w:val="pt-BR"/>
+        </w:rPr>
+        <w:lastRenderedPageBreak/>
+        <w:t>Foi o que ocorreu na bancada: na primeira montagem, três emissores a 0,44 m produziram 42,6 lux sem difusor, mais de quatro vezes o valor da classe. Na caixa atual, que substituiu a primeira em 10 de outubro de 2026, a primeira leitura com o difusor deu 2,05 vezes o valor da classe; ajustado o difusor, a leitura a ciclo de trabalho pleno ficou em 1,57 vez.</w:t>
       </w:r>
     </w:p>
     <w:p>
@@ -15132,6 +15174,7 @@
                 <w:sz w:val="20"/>
                 <w:szCs w:val="20"/>
               </w:rPr>
+              <w:lastRenderedPageBreak/>
               <w:t>Iluminação</w:t>
             </w:r>
             <w:proofErr w:type="spellEnd"/>
@@ -15685,19 +15728,7 @@
         <w:rPr>
           <w:lang w:val="pt-BR"/>
         </w:rPr>
-        <w:t xml:space="preserve">Medir 10 lux sob a iluminação de um recinto interno não produz resultado interpretável. O plano de medição é, por isso, alojado em anteparo opaco de face interna fosca, </w:t>
-      </w:r>
-      <w:r>
-        <w:rPr>
-          <w:lang w:val="pt-BR"/>
-        </w:rPr>
-        <w:t xml:space="preserve">com a luminária em uma extremidade e o sensor na outra (Figura 2).</w:t>
-      </w:r>
-      <w:r>
-        <w:rPr>
-          <w:lang w:val="pt-BR"/>
-        </w:rPr>
-        <w:t xml:space="preserve"> A providência não é expediente de conveniência: é condição para que a grandeza medida seja a iluminância produzida pelo nó.</w:t>
+        <w:t>Medir 10 lux sob a iluminação de um recinto interno não produz resultado interpretável. O plano de medição é, por isso, alojado em anteparo opaco de face interna fosca, com a luminária em uma extremidade e o sensor na outra (Figura 2). A providência não é expediente de conveniência: é condição para que a grandeza medida seja a iluminância produzida pelo nó.</w:t>
       </w:r>
     </w:p>
     <w:p>
@@ -15705,6 +15736,9 @@
         <w:keepNext/>
         <w:spacing w:before="130" w:after="60"/>
         <w:jc w:val="center"/>
+        <w:rPr>
+          <w:lang w:val="pt-BR"/>
+        </w:rPr>
       </w:pPr>
       <w:r>
         <w:rPr>
@@ -15712,7 +15746,8 @@
           <w:szCs w:val="20"/>
           <w:lang w:val="pt-BR"/>
         </w:rPr>
-        <w:t xml:space="preserve">Figura 2 – Interior do anteparo: luminária em uma extremidade e sensor na outra</w:t>
+        <w:lastRenderedPageBreak/>
+        <w:t>Figura 2 – Interior do anteparo: luminária em uma extremidade e sensor na outra</w:t>
       </w:r>
     </w:p>
     <w:p>
@@ -15744,7 +15779,7 @@
                     <pic:cNvPicPr/>
                   </pic:nvPicPr>
                   <pic:blipFill>
-                    <a:blip r:embed="rIdFoto105"/>
+                    <a:blip r:embed="rId9"/>
                     <a:stretch>
                       <a:fillRect/>
                     </a:stretch>
@@ -15769,6 +15804,9 @@
       <w:pPr>
         <w:spacing w:after="280"/>
         <w:jc w:val="center"/>
+        <w:rPr>
+          <w:lang w:val="pt-BR"/>
+        </w:rPr>
       </w:pPr>
       <w:r>
         <w:rPr>
@@ -15776,7 +15814,7 @@
           <w:szCs w:val="20"/>
           <w:lang w:val="pt-BR"/>
         </w:rPr>
-        <w:t xml:space="preserve">Fonte: Acervo dos autores (2026).</w:t>
+        <w:t>Fonte: Acervo dos autores (2026).</w:t>
       </w:r>
     </w:p>
     <w:p>
@@ -15841,6 +15879,7 @@
         <w:rPr>
           <w:lang w:val="pt-BR"/>
         </w:rPr>
+        <w:lastRenderedPageBreak/>
         <w:t>A exatidão absoluta do sensor adotado não é verificada, e a bancada não dispõe de instrumento de referência calibrado contra padrão metrológico. Essa é a limitação de medição do arranjo, e convém delimitar com precisão o que ela afeta e o que não afeta.</w:t>
       </w:r>
     </w:p>
@@ -15873,13 +15912,7 @@
         <w:rPr>
           <w:lang w:val="pt-BR"/>
         </w:rPr>
-        <w:t xml:space="preserve">Ela também não compromete as duas grandezas que a bancada efetivamente estabelece. A primeira é a latência entre a publicação do dado e a estabilização da iluminância, que é medida em tempo e não em lux. A segunda é a trajetória normalizada do fluxo, isto é, a razão entre a iluminância corrente e a iluminância plena </w:t>
-      </w:r>
-      <w:r>
-        <w:rPr>
-          <w:lang w:val="pt-BR"/>
-        </w:rPr>
-        <w:t>— e é precisamente nessa forma relativa que a norma expressa a restrição de taxa. Um erro sistemático de escala cancela-se na razão.</w:t>
+        <w:t>Ela também não compromete as duas grandezas que a bancada efetivamente estabelece. A primeira é a latência entre a publicação do dado e a estabilização da iluminância, que é medida em tempo e não em lux. A segunda é a trajetória normalizada do fluxo, isto é, a razão entre a iluminância corrente e a iluminância plena — e é precisamente nessa forma relativa que a norma expressa a restrição de taxa. Um erro sistemático de escala cancela-se na razão.</w:t>
       </w:r>
     </w:p>
     <w:p>
@@ -15911,7 +15944,14 @@
         <w:rPr>
           <w:lang w:val="pt-BR"/>
         </w:rPr>
-        <w:t>Restam, portanto, três propriedades a estabelecer, todas insensíveis ao erro sistemático e todas verificáveis com uma única cadeia de medição. A primeira é a repetibilidade: cada nível comandado é repetido em séries independentes, e a dispersão das leituras é reportada. A segunda é a monotonicidade e a linearidade da resposta: o ciclo de trabalho é varrido em degraus ao longo de toda a excursão, e a curva de iluminância resultante é levantada e reportada, por ser a propriedade de que dependem as afirmações relativas. A terceira é o controle da parcela ambiente, tratado em 3.4.3. Nenhuma delas se confunde com a verificação prevista na norma para instalações, nos termos delimitados na abertura de 3.4.2.</w:t>
+        <w:t xml:space="preserve">Restam, portanto, três propriedades a estabelecer, todas insensíveis ao erro sistemático e todas verificáveis com uma única cadeia de medição. A primeira é a repetibilidade: cada nível comandado é repetido em séries independentes, e a dispersão das leituras é reportada. A segunda é a monotonicidade e a linearidade da resposta: o ciclo de trabalho é varrido em degraus ao longo de toda a excursão, e a curva de iluminância resultante é levantada e reportada, por ser a propriedade de que dependem as afirmações relativas. A terceira é o controle da parcela ambiente, tratado </w:t>
+      </w:r>
+      <w:r>
+        <w:rPr>
+          <w:lang w:val="pt-BR"/>
+        </w:rPr>
+        <w:lastRenderedPageBreak/>
+        <w:t>em 3.4.3. Nenhuma delas se confunde com a verificação prevista na norma para instalações, nos termos delimitados na abertura de 3.4.2.</w:t>
       </w:r>
     </w:p>
     <w:p>
@@ -15927,13 +15967,7 @@
         <w:rPr>
           <w:lang w:val="pt-BR"/>
         </w:rPr>
-        <w:t xml:space="preserve">O procedimento de calibração estabelece essas propriedades em uma única sessão. Medida a residual, o ciclo de trabalho é varrido em 33 degraus, em três séries independentes, e cada ponto é a média de três leituras. Os ciclos de trabalho correspondentes a 10 lux e a 5 lux são então localizados por bisseção sobre o próprio hardware — cada passo da busca é uma medição, e nenhum valor decorre de conta sobre o teto — e cada um é repetido três vezes, com apagamento entre as repetições. A tabela que converte nível em ciclo de trabalho, gravada no banco e na memória do nó, contém apenas pontos medidos, com o fluxo pleno e o piso exatamente nos ciclos localizados; entre pontos medidos, o nó interpola linearmente. Na sessão adotada, feita na caixa atual, 10 lux correspondem a 65,6 % do ciclo de trabalho e 5 lux a 34,0 %, e a maior dispersão entre séries na faixa de operação foi de 0,86 %; as três repetições do pleno deram a mesma leitura, e as do piso diferiram em 0,73 %. Em </w:t>
-      </w:r>
-      <w:r>
-        <w:rPr>
-          <w:lang w:val="pt-BR"/>
-        </w:rPr>
-        <w:t>ensaio de estabilidade de dez minutos a ciclo pleno, feito na primeira caixa, o desvio-padrão das leituras foi de 0,2 %, no limite da resolução do sensor.</w:t>
+        <w:t>O procedimento de calibração estabelece essas propriedades em uma única sessão. Medida a residual, o ciclo de trabalho é varrido em 33 degraus, em três séries independentes, e cada ponto é a média de três leituras. Os ciclos de trabalho correspondentes a 10 lux e a 5 lux são então localizados por bisseção sobre o próprio hardware — cada passo da busca é uma medição, e nenhum valor decorre de conta sobre o teto — e cada um é repetido três vezes, com apagamento entre as repetições. A tabela que converte nível em ciclo de trabalho, gravada no banco e na memória do nó, contém apenas pontos medidos, com o fluxo pleno e o piso exatamente nos ciclos localizados; entre pontos medidos, o nó interpola linearmente. Na sessão adotada, feita na caixa atual, 10 lux correspondem a 65,6 % do ciclo de trabalho e 5 lux a 34,0 %, e a maior dispersão entre séries na faixa de operação foi de 0,86 %; as três repetições do pleno deram a mesma leitura, e as do piso diferiram em 0,73 %. Em ensaio de estabilidade de dez minutos a ciclo pleno, feito na primeira caixa, o desvio-padrão das leituras foi de 0,2 %, no limite da resolução do sensor.</w:t>
       </w:r>
     </w:p>
     <w:p>
@@ -15981,7 +16015,14 @@
         <w:rPr>
           <w:lang w:val="pt-BR"/>
         </w:rPr>
-        <w:t>A escolha por um único nó é deliberada e declarada. O objeto do trabalho é a camada de decisão, não o dispositivo; multiplicar nós acrescentaria custo e tempo sem acrescentar resultado. O controle coordenado de múltiplas luminárias é registrado entre as limitações e entre as recomendações de 6.1.</w:t>
+        <w:t xml:space="preserve">A escolha por um único nó é deliberada e declarada. O objeto do trabalho é a camada de decisão, não o dispositivo; multiplicar nós acrescentaria custo e tempo </w:t>
+      </w:r>
+      <w:r>
+        <w:rPr>
+          <w:lang w:val="pt-BR"/>
+        </w:rPr>
+        <w:lastRenderedPageBreak/>
+        <w:t>sem acrescentar resultado. O controle coordenado de múltiplas luminárias é registrado entre as limitações e entre as recomendações de 6.1.</w:t>
       </w:r>
     </w:p>
     <w:p>
@@ -16030,13 +16071,7 @@
         <w:rPr>
           <w:lang w:val="pt-BR"/>
         </w:rPr>
-        <w:t xml:space="preserve">Três diagnósticos derivam dessa comparação e são avaliados sobre a bancada. O primeiro é a falha total: comando de nível não nulo acompanhado de </w:t>
-      </w:r>
-      <w:r>
-        <w:rPr>
-          <w:lang w:val="pt-BR"/>
-        </w:rPr>
-        <w:t>leitura equivalente à iluminância residual registrada em 3.4.3 caracteriza luminária apagada, e a condição é induzida deliberadamente, por interrupção do ramo de potência, para que a detecção seja verificada e não apenas afirmada. O segundo é a divergência entre o nível emitido e o nível entregue, apurada a cada leitura recebida sobre a razão entre a iluminância medida e a correspondente ao comando. O terceiro é o alerta de perda de controle, emitido quando a divergência persiste acima de tolerância declarada por número de leituras consecutivas.</w:t>
+        <w:t>Três diagnósticos derivam dessa comparação e são avaliados sobre a bancada. O primeiro é a falha total: comando de nível não nulo acompanhado de leitura equivalente à iluminância residual registrada em 3.4.3 caracteriza luminária apagada, e a condição é induzida deliberadamente, por interrupção do ramo de potência, para que a detecção seja verificada e não apenas afirmada. O segundo é a divergência entre o nível emitido e o nível entregue, apurada a cada leitura recebida sobre a razão entre a iluminância medida e a correspondente ao comando. O terceiro é o alerta de perda de controle, emitido quando a divergência persiste acima de tolerância declarada por número de leituras consecutivas.</w:t>
       </w:r>
     </w:p>
     <w:p>
@@ -16068,7 +16103,14 @@
         <w:rPr>
           <w:lang w:val="pt-BR"/>
         </w:rPr>
-        <w:t>Os dois alertas têm limiares distintos porque os fenômenos são distintos. A falha total é condição inequívoca, e o alerta é aberto após três leituras consecutivas. A perda de controle é gradual — sujeira, depreciação, deslocamento —, não exige ação em segundos, e o alerta só é aberto após doze leituras, o que praticamente elimina o alarme falso. Como o nó responde a cada comando, e o comando só é emitido quando o alvo muda ou precisa ser renovado (3.5.2), as leituras são espaçadas, e o alerta de perda de controle leva dezenas de minutos para ser aberto. Em ambos os casos o alerta é registro: não altera o nível de iluminação, função que cabe exclusivamente ao failsafe do nó.</w:t>
+        <w:t xml:space="preserve">Os dois alertas têm limiares distintos porque os fenômenos são distintos. A falha total é condição inequívoca, e o alerta é aberto após três leituras consecutivas. A perda de controle é gradual — sujeira, depreciação, deslocamento —, não exige </w:t>
+      </w:r>
+      <w:r>
+        <w:rPr>
+          <w:lang w:val="pt-BR"/>
+        </w:rPr>
+        <w:lastRenderedPageBreak/>
+        <w:t>ação em segundos, e o alerta só é aberto após doze leituras, o que praticamente elimina o alarme falso. Como o nó responde a cada comando, e o comando só é emitido quando o alvo muda ou precisa ser renovado (3.5.2), as leituras são espaçadas, e o alerta de perda de controle leva dezenas de minutos para ser aberto. Em ambos os casos o alerta é registro: não altera o nível de iluminação, função que cabe exclusivamente ao failsafe do nó.</w:t>
       </w:r>
     </w:p>
     <w:p>
@@ -16084,13 +16126,7 @@
         <w:rPr>
           <w:lang w:val="pt-BR"/>
         </w:rPr>
-        <w:t xml:space="preserve">No parque, o ponto de luz não dispõe de sensor de iluminância (Quadro 2), e a grandeza de retorno é outra: o controlador de telegestão reporta as grandezas elétricas do ponto de luz (Quadro 3). A comparação conserva a forma — o medido contra o esperado para o nível comandado —, com a potência no lugar da iluminância: sob a hipótese de proporcionalidade de 3.11, a potência esperada é a nominal multiplicada pelo nível, corrigida pela curva do regulador de corrente quando esta for conhecida. Os três diagnósticos transpõem-se: a falha total, como comando de nível </w:t>
-      </w:r>
-      <w:r>
-        <w:rPr>
-          <w:lang w:val="pt-BR"/>
-        </w:rPr>
-        <w:t>não nulo acompanhado de potência próxima de zero; a divergência, como razão entre a potência medida e a esperada; e a perda de controle, como divergência persistente. O que não se transpõe é o alcance. A grandeza elétrica atesta que o comando foi executado pelo regulador, e não que a luz chegou à via: a sujeira do refrator, a obstrução por vegetação e a depreciação do fluxo a potência constante passam despercebidas por ela.</w:t>
+        <w:t>No parque, o ponto de luz não dispõe de sensor de iluminância (Quadro 2), e a grandeza de retorno é outra: o controlador de telegestão reporta as grandezas elétricas do ponto de luz (Quadro 3). A comparação conserva a forma — o medido contra o esperado para o nível comandado —, com a potência no lugar da iluminância: sob a hipótese de proporcionalidade de 3.11, a potência esperada é a nominal multiplicada pelo nível, corrigida pela curva do regulador de corrente quando esta for conhecida. Os três diagnósticos transpõem-se: a falha total, como comando de nível não nulo acompanhado de potência próxima de zero; a divergência, como razão entre a potência medida e a esperada; e a perda de controle, como divergência persistente. O que não se transpõe é o alcance. A grandeza elétrica atesta que o comando foi executado pelo regulador, e não que a luz chegou à via: a sujeira do refrator, a obstrução por vegetação e a depreciação do fluxo a potência constante passam despercebidas por ela.</w:t>
       </w:r>
     </w:p>
     <w:p>
@@ -16138,6 +16174,7 @@
         <w:rPr>
           <w:lang w:val="pt-BR"/>
         </w:rPr>
+        <w:lastRenderedPageBreak/>
         <w:t>3.5 Dados urbanos e construção dos cenários</w:t>
       </w:r>
       <w:bookmarkEnd w:id="34"/>
@@ -16269,7 +16306,14 @@
         <w:rPr>
           <w:lang w:val="pt-BR"/>
         </w:rPr>
-        <w:t>A interface precisa dizer não apenas o que ocorre, mas onde. Com um único ponto de luz, todo evento valeria para ele; com mais de um, é preciso saber qual câmera observa a via que qual luminária ilumina. A plataforma publica, por isso, dois tipos de informação por trecho de via. O primeiro é o volume de movimentação: a média de pessoas presentes na área do trecho num período de 5 min. O segundo é a ocorrência de segurança ou de trânsito, publicada no momento em que é detectada, e o seu encerramento. A plataforma entrega contagem, e não nível normalizado: quem conhece a via é o serviço de decisão, que compara o volume com o movimento habitual daquele trecho (3.6).</w:t>
+        <w:t xml:space="preserve">A interface precisa dizer não apenas o que ocorre, mas onde. Com um único ponto de luz, todo evento valeria para ele; com mais de um, é preciso saber qual </w:t>
+      </w:r>
+      <w:r>
+        <w:rPr>
+          <w:lang w:val="pt-BR"/>
+        </w:rPr>
+        <w:lastRenderedPageBreak/>
+        <w:t>câmera observa a via que qual luminária ilumina. A plataforma publica, por isso, dois tipos de informação por trecho de via. O primeiro é o volume de movimentação: a média de pessoas presentes na área do trecho num período de 5 min. O segundo é a ocorrência de segurança ou de trânsito, publicada no momento em que é detectada, e o seu encerramento. A plataforma entrega contagem, e não nível normalizado: quem conhece a via é o serviço de decisão, que compara o volume com o movimento habitual daquele trecho (3.6).</w:t>
       </w:r>
     </w:p>
     <w:p>
@@ -16285,13 +16329,7 @@
         <w:rPr>
           <w:lang w:val="pt-BR"/>
         </w:rPr>
-        <w:t xml:space="preserve">O volume é ocupação, e não soma de passagens. A câmera informa quantas pessoas estão na área a cada instante, e a média dessas contagens no período é o volume. Uma pessoa que entra e sai da imagem várias vezes conta como uma em cada instante em que está presente, e nunca como várias; uma detecção intermitente reduz a média, sem inflá-la. O dado de origem é o analítico de contagem de pessoas </w:t>
-      </w:r>
-      <w:r>
-        <w:rPr>
-          <w:lang w:val="pt-BR"/>
-        </w:rPr>
-        <w:t>por área que o termo de referência da plataforma já exige (2.3). A detecção de densidade serviria igualmente, se publicada como número, convertida em pessoas pela área do trecho; a contagem de passagens não serve, justamente por somar duas vezes a mesma pessoa.</w:t>
+        <w:t>O volume é ocupação, e não soma de passagens. A câmera informa quantas pessoas estão na área a cada instante, e a média dessas contagens no período é o volume. Uma pessoa que entra e sai da imagem várias vezes conta como uma em cada instante em que está presente, e nunca como várias; uma detecção intermitente reduz a média, sem inflá-la. O dado de origem é o analítico de contagem de pessoas por área que o termo de referência da plataforma já exige (2.3). A detecção de densidade serviria igualmente, se publicada como número, convertida em pessoas pela área do trecho; a contagem de passagens não serve, justamente por somar duas vezes a mesma pessoa.</w:t>
       </w:r>
     </w:p>
     <w:p>
@@ -16323,7 +16361,14 @@
         <w:rPr>
           <w:lang w:val="pt-BR"/>
         </w:rPr>
-        <w:t>A interface admite dois modos de envio, à escolha da plataforma: um trecho por mensagem ou um pacote com os trechos de uma região, de até 500 itens. Nos dois, cada trecho deve ser atualizado a cada 5 min, e os envios devem ser distribuídos ao longo do período, e não concentrados no mesmo instante. Com 50 mil câmeras, isso resulta em cerca de 170 publicações por segundo, carga modesta para um serviço em nuvem. No pacote, um item inválido é recusado sozinho, com o motivo, e os demais são gravados. Resumir o dado na origem e publicar apenas a medida derivada reforça a proteção de dados de 3.10: a média de um período diz ainda menos sobre cada pessoa do que a contagem de um instante.</w:t>
+        <w:t xml:space="preserve">A interface admite dois modos de envio, à escolha da plataforma: um trecho por mensagem ou um pacote com os trechos de uma região, de até 500 itens. Nos dois, cada trecho deve ser atualizado a cada 5 min, e os envios devem ser distribuídos ao longo do período, e não concentrados no mesmo instante. Com 50 mil câmeras, isso resulta em cerca de 170 publicações por segundo, carga modesta para um serviço em nuvem. No pacote, um item inválido é recusado sozinho, com o motivo, e os demais são gravados. Resumir o dado na origem e publicar apenas a medida </w:t>
+      </w:r>
+      <w:r>
+        <w:rPr>
+          <w:lang w:val="pt-BR"/>
+        </w:rPr>
+        <w:lastRenderedPageBreak/>
+        <w:t>derivada reforça a proteção de dados de 3.10: a média de um período diz ainda menos sobre cada pessoa do que a contagem de um instante.</w:t>
       </w:r>
     </w:p>
     <w:p>
@@ -16339,13 +16384,7 @@
         <w:rPr>
           <w:lang w:val="pt-BR"/>
         </w:rPr>
-        <w:t xml:space="preserve">As duas pontas da cadeia já são georreferenciadas. As câmeras do Smart Sampa são cadastradas com latitude, longitude, endereço, distrito e subprefeitura (SÃO PAULO, 2024). O Caderno de Encargos exige o cadastro técnico georreferenciado do parque, com posição e código cadastral de cada ponto de luz, integrado à base cartográfica do município, e é por esse cadastro que a telegestão atua sobre cada ponto (SÃO PAULO, 2015, itens 13, 13.1 e 13.3). O cadastro é público: o GeoSampa, portal cartográfico municipal, publicava, em consulta de 27 de setembro de 2026, 662.945 pontos de iluminação, cada um com placa e coordenadas, e 218.768 segmentos de logradouro, cada um com o código oficial do logradouro e </w:t>
-      </w:r>
-      <w:r>
-        <w:rPr>
-          <w:lang w:val="pt-BR"/>
-        </w:rPr>
-        <w:t>sua geometria (SÃO PAULO, 2026c). O que falta é a regra que liga um lugar observado a um ponto de luz.</w:t>
+        <w:t>As duas pontas da cadeia já são georreferenciadas. As câmeras do Smart Sampa são cadastradas com latitude, longitude, endereço, distrito e subprefeitura (SÃO PAULO, 2024). O Caderno de Encargos exige o cadastro técnico georreferenciado do parque, com posição e código cadastral de cada ponto de luz, integrado à base cartográfica do município, e é por esse cadastro que a telegestão atua sobre cada ponto (SÃO PAULO, 2015, itens 13, 13.1 e 13.3). O cadastro é público: o GeoSampa, portal cartográfico municipal, publicava, em consulta de 27 de setembro de 2026, 662.945 pontos de iluminação, cada um com placa e coordenadas, e 218.768 segmentos de logradouro, cada um com o código oficial do logradouro e sua geometria (SÃO PAULO, 2026c). O que falta é a regra que liga um lugar observado a um ponto de luz.</w:t>
       </w:r>
     </w:p>
     <w:p>
@@ -16377,7 +16416,14 @@
         <w:rPr>
           <w:lang w:val="pt-BR"/>
         </w:rPr>
-        <w:t>A associação foi construída sobre dado real. Recortou-se do GeoSampa um quarteirão do Jardim Helena, na zona leste, com 16 trechos e 36 postes. O nó de bancada representa um desses postes, próximo de uma esquina e associado a três trechos, e um segundo ponto, simulado, representa um poste de meio de quadra, associado a um único trecho. Dois achados decorrem do dado. O primeiro é que os segmentos do cadastro são curtos, de 30 m a 100 m, e com o raio adotado 17 dos 36 postes caem em três ou mais trechos, o que é conservador para a segurança e reduz a atenuação. O segundo é que o cadastro tem ruído — placa duplicada, poste a mais de 25 m de qualquer trecho, endereço em texto livre —, e por isso a associação é geométrica, e não por nome de rua.</w:t>
+        <w:t xml:space="preserve">A associação foi construída sobre dado real. Recortou-se do GeoSampa um quarteirão do Jardim Helena, na zona leste, com 16 trechos e 36 postes. O nó de bancada representa um desses postes, próximo de uma esquina e associado a três trechos, e um segundo ponto, simulado, representa um poste de meio de quadra, associado a um único trecho. Dois achados decorrem do dado. O primeiro é que os segmentos do cadastro são curtos, de 30 m a 100 m, e com o raio adotado 17 dos 36 postes caem em três ou mais trechos, o que é conservador para a segurança e reduz </w:t>
+      </w:r>
+      <w:r>
+        <w:rPr>
+          <w:lang w:val="pt-BR"/>
+        </w:rPr>
+        <w:lastRenderedPageBreak/>
+        <w:t>a atenuação. O segundo é que o cadastro tem ruído — placa duplicada, poste a mais de 25 m de qualquer trecho, endereço em texto livre —, e por isso a associação é geométrica, e não por nome de rua.</w:t>
       </w:r>
     </w:p>
     <w:p>
@@ -16442,7 +16488,14 @@
         <w:rPr>
           <w:lang w:val="pt-BR"/>
         </w:rPr>
-        <w:t>A camada de previsão estima o nível de movimentação na próxima janela de operação a partir das janelas anteriores. Seu treinamento requer série histórica de contagem de pedestres com granularidade inferior à hora, e aqui se impõe uma constatação que o próprio trabalho denuncia: o município de São Paulo não disponibiliza série dessa natureza em seu portal de dados abertos. A consulta ao catálogo municipal, realizada em setembro de 2026, retorna para o termo pedestre um único conjunto, o cadastro de lombadas; e os dois conjuntos intitulados fluxo de pessoas correspondem a relatórios mensais de público de equipamentos concedidos, sem granularidade horária e sem referência a via pública. A contagem de pessoas é exigida contratualmente da plataforma municipal de videomonitoramento, conforme documentado em 2.3, e não é publicada.</w:t>
+        <w:t xml:space="preserve">A camada de previsão estima o nível de movimentação na próxima janela de operação a partir das janelas anteriores. Seu treinamento requer série histórica de contagem de pedestres com granularidade inferior à hora, e aqui se impõe uma </w:t>
+      </w:r>
+      <w:r>
+        <w:rPr>
+          <w:lang w:val="pt-BR"/>
+        </w:rPr>
+        <w:lastRenderedPageBreak/>
+        <w:t>constatação que o próprio trabalho denuncia: o município de São Paulo não disponibiliza série dessa natureza em seu portal de dados abertos. A consulta ao catálogo municipal, realizada em setembro de 2026, retorna para o termo pedestre um único conjunto, o cadastro de lombadas; e os dois conjuntos intitulados fluxo de pessoas correspondem a relatórios mensais de público de equipamentos concedidos, sem granularidade horária e sem referência a via pública. A contagem de pessoas é exigida contratualmente da plataforma municipal de videomonitoramento, conforme documentado em 2.3, e não é publicada.</w:t>
       </w:r>
     </w:p>
     <w:p>
@@ -16458,13 +16511,7 @@
         <w:rPr>
           <w:lang w:val="pt-BR"/>
         </w:rPr>
-        <w:t xml:space="preserve">Adota-se, em consequência, a contagem automática de pedestres da cidade de Zurique, em valores de 15 min e sob licença aberta (STADT ZÜRICH, 2026), que mede o mesmo fenômeno que a classe P da ABNT NBR 5101 disciplina: a circulação </w:t>
-      </w:r>
-      <w:r>
-        <w:rPr>
-          <w:lang w:val="pt-BR"/>
-        </w:rPr>
-        <w:t>de pedestres em via urbana. Emprega-se a janela de 2016 a 2019, anterior à pandemia; o arquivo foi baixado em 30 de setembro de 2026, e o resumo SHA-256 da cópia empregada é registrado, uma vez que o portal o atualiza. Entre as séries públicas com histórico de anos localizadas pelos autores, a de 15 min é a mais próxima do período de 5 min em que a interface especificada publica o volume (3.5.2).</w:t>
+        <w:t>Adota-se, em consequência, a contagem automática de pedestres da cidade de Zurique, em valores de 15 min e sob licença aberta (STADT ZÜRICH, 2026), que mede o mesmo fenômeno que a classe P da ABNT NBR 5101 disciplina: a circulação de pedestres em via urbana. Emprega-se a janela de 2016 a 2019, anterior à pandemia; o arquivo foi baixado em 30 de setembro de 2026, e o resumo SHA-256 da cópia empregada é registrado, uma vez que o portal o atualiza. Entre as séries públicas com histórico de anos localizadas pelos autores, a de 15 min é a mais próxima do período de 5 min em que a interface especificada publica o volume (3.5.2).</w:t>
       </w:r>
     </w:p>
     <w:p>
@@ -16496,7 +16543,14 @@
         <w:rPr>
           <w:lang w:val="pt-BR"/>
         </w:rPr>
-        <w:t>O protocolo de avaliação é o usual para séries temporais e evita vazamento de informação: a partição entre treino e teste é cronológica, com o período final reservado ao teste, e o desempenho é reportado em erro absoluto médio e em raiz do erro quadrático médio. O modelo é confrontado com duas referências ingênuas — a persistência, que projeta o valor corrente, e a média sazonal, que projeta a média histórica daquela hora naquele dia da semana. É confrontado também com dois modelos de aprendizado treinados sobre a mesma partição e os mesmos atributos, sem ajuste de hiperparâmetros: uma regressão linear, o modelo mais simples da família, e uma floresta aleatória, o outro modelo de árvores de uso corrente. A regra de leitura foi registrada antes do treino: há superioridade quando o erro absoluto médio é ao menos 2 % menor e menor na maioria dos sensores; diferença abaixo de 2 % é equivalência. A comparação é o que separa aprendizado de ornamento: caso o modelo treinado não supere as referências, o resultado é reportado como tal, e a conclusão é que um perfil horário fixo bastaria ao caso — achado igualmente informativo para a especificação da interface.</w:t>
+        <w:t xml:space="preserve">O protocolo de avaliação é o usual para séries temporais e evita vazamento de informação: a partição entre treino e teste é cronológica, com o período final reservado ao teste, e o desempenho é reportado em erro absoluto médio e em raiz do erro quadrático médio. O modelo é confrontado com duas referências ingênuas — a persistência, que projeta o valor corrente, e a média sazonal, que projeta a média histórica daquela hora naquele dia da semana. É confrontado também com dois modelos de aprendizado treinados sobre a mesma partição e os mesmos atributos, </w:t>
+      </w:r>
+      <w:r>
+        <w:rPr>
+          <w:lang w:val="pt-BR"/>
+        </w:rPr>
+        <w:lastRenderedPageBreak/>
+        <w:t>sem ajuste de hiperparâmetros: uma regressão linear, o modelo mais simples da família, e uma floresta aleatória, o outro modelo de árvores de uso corrente. A regra de leitura foi registrada antes do treino: há superioridade quando o erro absoluto médio é ao menos 2 % menor e menor na maioria dos sensores; diferença abaixo de 2 % é equivalência. A comparação é o que separa aprendizado de ornamento: caso o modelo treinado não supere as referências, o resultado é reportado como tal, e a conclusão é que um perfil horário fixo bastaria ao caso — achado igualmente informativo para a especificação da interface.</w:t>
       </w:r>
     </w:p>
     <w:p>
@@ -16512,13 +16566,7 @@
         <w:rPr>
           <w:lang w:val="pt-BR"/>
         </w:rPr>
-        <w:t xml:space="preserve">São retidos os 14 pontos com ao menos 730 dias de registro e cobertura igual ou superior a 95 % na janela, 12 deles com dados no ano de teste; o treino vai até 2018, e o teste é o ano de 2019. A preparação segue roteiro fixado antes do treino: os </w:t>
-      </w:r>
-      <w:r>
-        <w:rPr>
-          <w:lang w:val="pt-BR"/>
-        </w:rPr>
-        <w:t>carimbos repetidos na mudança de horário de verão são combinados pela média; sequências de contagem nula por oito horas ou mais que incluam horário diurno são tratadas como sensor travado e descartadas; o percentil 99 de cada ponto é calculado só no treino. Os atributos do modelo são o nível de 15, 30, 45 e 60 min, de 2 h, de 24 h e de 7 dias antes; as médias da última hora, das últimas três e das últimas vinte e quatro horas; a hora do dia, o quarto de hora, o instante do dia em forma de seno e cosseno, o dia da semana, o fim de semana e o feriado. O alvo é o nível médio dos 60 min seguintes. No treino, os feriados são os de Zurique, onde a série é medida; em operação, os nacionais brasileiros — é o atributo que muda de calendário com a cidade, e não o modelo. Sem histórico suficiente para os atributos de atraso, o serviço recorre à persistência em vez de extrapolar sobre a lacuna.</w:t>
+        <w:t>São retidos os 14 pontos com ao menos 730 dias de registro e cobertura igual ou superior a 95 % na janela, 12 deles com dados no ano de teste; o treino vai até 2018, e o teste é o ano de 2019. A preparação segue roteiro fixado antes do treino: os carimbos repetidos na mudança de horário de verão são combinados pela média; sequências de contagem nula por oito horas ou mais que incluam horário diurno são tratadas como sensor travado e descartadas; o percentil 99 de cada ponto é calculado só no treino. Os atributos do modelo são o nível de 15, 30, 45 e 60 min, de 2 h, de 24 h e de 7 dias antes; as médias da última hora, das últimas três e das últimas vinte e quatro horas; a hora do dia, o quarto de hora, o instante do dia em forma de seno e cosseno, o dia da semana, o fim de semana e o feriado. O alvo é o nível médio dos 60 min seguintes. No treino, os feriados são os de Zurique, onde a série é medida; em operação, os nacionais brasileiros — é o atributo que muda de calendário com a cidade, e não o modelo. Sem histórico suficiente para os atributos de atraso, o serviço recorre à persistência em vez de extrapolar sobre a lacuna.</w:t>
       </w:r>
     </w:p>
     <w:p>
@@ -16550,13 +16598,8 @@
         <w:rPr>
           <w:lang w:val="pt-BR"/>
         </w:rPr>
-        <w:t xml:space="preserve">A régua segue quatro requisitos do projeto: escala de 0, via vazia, a 1, o cheio típico da via; pouca influência de eventos raros; estabilidade com 28 dias de dado; e cálculo simples, trecho a trecho, no banco. A normalização pelo máximo deixaria um único evento definir a escala; a padronização pela média e pelo desvio produz valores negativos e sem limite; a escala pela mediana e pela dispersão central cresce sem controle à noite, quando a mediana é quase zero; e a transformação em postos perde a proporção entre os volumes. Em 28 dias, o percentil 99 é definido por cerca dos 27 blocos mais cheios: o bastante para a estimativa ser estável, e pouco o bastante para deixar os eventos raros acima dela, onde o nível é limitado a 1. O valor 99 é critério dos autores. Num teste de sensibilidade feito depois da escolha, trocar o 99 por 95, 99,5 ou 99,9 manteve a mesma faixa de movimentação em 95,7 % a 99,2 % dos blocos noturnos de 2019, pela régua do treino e pela de 28 dias; o percentil 95 deixa </w:t>
-      </w:r>
-      <w:r>
-        <w:rPr>
-          <w:lang w:val="pt-BR"/>
-        </w:rPr>
-        <w:t>5,5 % dos blocos no limite de 1, e a variação diária da régua ficou abaixo de 5 % em 95 % dos dias, nos quatro percentis.</w:t>
+        <w:lastRenderedPageBreak/>
+        <w:t>A régua segue quatro requisitos do projeto: escala de 0, via vazia, a 1, o cheio típico da via; pouca influência de eventos raros; estabilidade com 28 dias de dado; e cálculo simples, trecho a trecho, no banco. A normalização pelo máximo deixaria um único evento definir a escala; a padronização pela média e pelo desvio produz valores negativos e sem limite; a escala pela mediana e pela dispersão central cresce sem controle à noite, quando a mediana é quase zero; e a transformação em postos perde a proporção entre os volumes. Em 28 dias, o percentil 99 é definido por cerca dos 27 blocos mais cheios: o bastante para a estimativa ser estável, e pouco o bastante para deixar os eventos raros acima dela, onde o nível é limitado a 1. O valor 99 é critério dos autores. Num teste de sensibilidade feito depois da escolha, trocar o 99 por 95, 99,5 ou 99,9 manteve a mesma faixa de movimentação em 95,7 % a 99,2 % dos blocos noturnos de 2019, pela régua do treino e pela de 28 dias; o percentil 95 deixa 5,5 % dos blocos no limite de 1, e a variação diária da régua ficou abaixo de 5 % em 95 % dos dias, nos quatro percentis.</w:t>
       </w:r>
     </w:p>
     <w:p>
@@ -16588,7 +16631,14 @@
         <w:rPr>
           <w:lang w:val="pt-BR"/>
         </w:rPr>
-        <w:t>A série de Zurique substituiu, depois de obtidos os primeiros resultados, a série horária de pedestres de Melbourne (CITY OF MELBOURNE, 2026), adotada nas versões anteriores, e a troca é declarada por ter sido decidida à vista deles. Com a série horária, o modelo superava as referências no erro, mas, no sistema, a média sazonal do próprio ponto o igualava; um experimento com protocolo fixado antes do treino, sobre a série de Zurique, mostrou que a vantagem do modelo sobre a melhor referência simples aparece na resolução de 15 min e desaparece com os mesmos dados somados por hora (4.6, Tabela 4). O critério de leitura daquele experimento — superar a melhor referência simples, no período noturno, em ao menos 2 pontos percentuais no acerto da faixa e em ao menos 0,02 na medida F1 — foi mantido para o modelo em operação. Os limiares são critério dos autores, e não valor de norma ou de literatura; o que lhes dá validade é terem sido fixados antes do resultado. Fica, da série de Melbourne, um achado: quando o dado de movimento só existe por hora, o modelo treinado é substituível por uma média sazonal, e a solução entrega menos do que a sua arquitetura permite.</w:t>
+        <w:t xml:space="preserve">A série de Zurique substituiu, depois de obtidos os primeiros resultados, a série horária de pedestres de Melbourne (CITY OF MELBOURNE, 2026), adotada nas versões anteriores, e a troca é declarada por ter sido decidida à vista deles. Com a série horária, o modelo superava as referências no erro, mas, no sistema, a média sazonal do próprio ponto o igualava; um experimento com protocolo fixado antes do treino, sobre a série de Zurique, mostrou que a vantagem do modelo sobre a melhor referência simples aparece na resolução de 15 min e desaparece com os mesmos dados somados por hora (4.6, Tabela 4). O critério de leitura daquele experimento — </w:t>
+      </w:r>
+      <w:r>
+        <w:rPr>
+          <w:lang w:val="pt-BR"/>
+        </w:rPr>
+        <w:lastRenderedPageBreak/>
+        <w:t>superar a melhor referência simples, no período noturno, em ao menos 2 pontos percentuais no acerto da faixa e em ao menos 0,02 na medida F1 — foi mantido para o modelo em operação. Os limiares são critério dos autores, e não valor de norma ou de literatura; o que lhes dá validade é terem sido fixados antes do resultado. Fica, da série de Melbourne, um achado: quando o dado de movimento só existe por hora, o modelo treinado é substituível por uma média sazonal, e a solução entrega menos do que a sua arquitetura permite.</w:t>
       </w:r>
     </w:p>
     <w:p>
@@ -16621,13 +16671,7 @@
         <w:rPr>
           <w:lang w:val="pt-BR"/>
         </w:rPr>
-        <w:t xml:space="preserve">A decisão é produzida por sistema de inferência nebulosa do tipo Mamdani, cuja construção compreende a definição das variáveis de entrada e de seus conjuntos linguísticos, a formulação da base de regras e o método de agregação e de </w:t>
-      </w:r>
-      <w:r>
-        <w:rPr>
-          <w:lang w:val="pt-BR"/>
-        </w:rPr>
-        <w:t>defuzificação. O Quadro 7 discrimina as variáveis de entrada, entre as quais figura a estimativa produzida pela camada de previsão descrita em 3.6.</w:t>
+        <w:t>A decisão é produzida por sistema de inferência nebulosa do tipo Mamdani, cuja construção compreende a definição das variáveis de entrada e de seus conjuntos linguísticos, a formulação da base de regras e o método de agregação e de defuzificação. O Quadro 7 discrimina as variáveis de entrada, entre as quais figura a estimativa produzida pela camada de previsão descrita em 3.6.</w:t>
       </w:r>
     </w:p>
     <w:p>
@@ -17158,6 +17202,7 @@
                 <w:szCs w:val="20"/>
                 <w:lang w:val="pt-BR"/>
               </w:rPr>
+              <w:lastRenderedPageBreak/>
               <w:t>Classe de iluminação da via</w:t>
             </w:r>
           </w:p>
@@ -17245,13 +17290,14 @@
         <w:rPr>
           <w:lang w:val="pt-BR"/>
         </w:rPr>
-        <w:t xml:space="preserve">Definidas as variáveis, restam as partições — os conjuntos linguísticos em que o universo de discurso de cada variável contínua é dividido. As variáveis de movimentação, a observada e a prevista, são particionadas em baixa, média e alta, e as fronteiras entre esses conjuntos são fixadas nos tercis da distribuição observada na série adotada, normalizada por ponto de medição. Na série adotada, as fronteiras resultam em 0,069 e 0,295 do nível normalizado, valores assimétricos que refletem a predominância de períodos de baixa circulação. Os dois valores são únicos e calculados sobre todos os blocos de 15 min do treino, de todos os pontos reunidos; no período noturno, em que o sistema decide, 56 % dos blocos do treino ficam na </w:t>
-      </w:r>
-      <w:r>
-        <w:rPr>
-          <w:lang w:val="pt-BR"/>
-        </w:rPr>
-        <w:t>faixa baixa. Os valores não são arbitrados: derivam do dado e são reproduzíveis por qualquer leitor que aplique o mesmo procedimento à mesma série; a escolha dos tercis como critério é dos autores (5.3). A necessidade do critério decorre de uma lacuna da norma: a ABNT NBR 5101 condiciona a classe ao nível de atividade de pedestres e recomenda reduzir a iluminância nos horários de baixa movimentação (subseção 6.3 da norma), mas não fixa valores numéricos que distingam movimentação baixa, média e alta. Os tercis preenchem essa lacuna, e a normalização compara cada trecho com o seu próprio histórico. O número de conjuntos tampouco é arbitrário: corresponde ao número de classes que a norma admite para um mesmo ponto de luz em iluminação adaptativa — a classe da via e até duas imediatamente inferiores (6.10.2) —, de modo que cada conjunto de movimentação se associa a uma classe normativa. Caso a norma venha a admitir mais degraus, a camada de verificação continua a impor o piso lido da tabela de classes, e a ampliação exige apenas nova versão da base de regras, com partição correspondente. É também coerente com a normalização declarada em 3.6 — aplicados sobre o nível normalizado de cada ponto, os mesmos dois valores acompanham o patamar local de circulação, e o que se transfere da série de Zurique continua sendo a estrutura da distribuição, e não o valor absoluto de contagem. As demais variáveis não demandam esse tratamento: ocorrência reportada é categórica, a faixa horária é fixada pelo relógio e a classe de iluminação é atributo do ponto de luz.</w:t>
+        <w:t xml:space="preserve">Definidas as variáveis, restam as partições — os conjuntos linguísticos em que o universo de discurso de cada variável contínua é dividido. As variáveis de movimentação, a observada e a prevista, são particionadas em baixa, média e alta, e as fronteiras entre esses conjuntos são fixadas nos tercis da distribuição observada na série adotada, normalizada por ponto de medição. Na série adotada, as fronteiras resultam em 0,069 e 0,295 do nível normalizado, valores assimétricos que refletem a predominância de períodos de baixa circulação. Os dois valores são únicos e calculados sobre todos os blocos de 15 min do treino, de todos os pontos reunidos; no período noturno, em que o sistema decide, 56 % dos blocos do treino ficam na faixa baixa. Os valores não são arbitrados: derivam do dado e são reproduzíveis por qualquer leitor que aplique o mesmo procedimento à mesma série; a escolha dos tercis como critério é dos autores (5.3). A necessidade do critério decorre de uma lacuna da norma: a ABNT NBR 5101 condiciona a classe ao nível de atividade de pedestres e recomenda reduzir a iluminância nos horários de baixa movimentação (subseção 6.3 da norma), mas não fixa valores numéricos que distingam movimentação baixa, média e alta. Os tercis preenchem essa lacuna, e a normalização compara cada trecho com o seu próprio histórico. O número de conjuntos tampouco é arbitrário: corresponde ao número de classes que a norma admite para um mesmo ponto de luz em iluminação adaptativa — a classe da via e até duas imediatamente inferiores (6.10.2) —, de modo que cada conjunto de movimentação se associa a uma classe normativa. Caso a norma venha a admitir mais degraus, a camada de verificação continua a impor o piso lido da tabela de classes, e a ampliação exige apenas nova versão da base de regras, com partição correspondente. É também coerente com a normalização declarada em 3.6 — aplicados sobre o nível normalizado de cada ponto, os mesmos dois valores acompanham o patamar local de circulação, e o que se transfere da série de Zurique continua sendo a estrutura da distribuição, e não o valor absoluto de contagem. As demais variáveis não demandam esse tratamento: ocorrência reportada é categórica, </w:t>
+      </w:r>
+      <w:r>
+        <w:rPr>
+          <w:lang w:val="pt-BR"/>
+        </w:rPr>
+        <w:lastRenderedPageBreak/>
+        <w:t>a faixa horária é fixada pelo relógio e a classe de iluminação é atributo do ponto de luz.</w:t>
       </w:r>
     </w:p>
     <w:p>
@@ -17299,7 +17345,14 @@
         <w:rPr>
           <w:lang w:val="pt-BR"/>
         </w:rPr>
-        <w:t>A saída é expressa em degraus de classe: zero corresponde à classe da via, um à classe imediatamente inferior e dois à classe mínima admitida para dimerização. Os três conjuntos de saída são simétricos em torno de cada degrau, de modo que uma regra ativada isoladamente produz exatamente a classe correspondente, e a combinação de regras, um degrau intermediário. O degrau é convertido em fração contínua do fluxo pleno por interpolação linear entre as iluminâncias das classes, lidas da tabela de classes (RF09): para a classe P3, os degraus valem 1,0, 0,75 e 0,5 do pleno, isto é, as classes P3, P4 e P5 do Quadro 8, e nenhum desses valores reside no código. Classes com menos degraus disponíveis os repetem, e uma classe não dimerizável permanece sempre no pleno. O piso continua a ser imposto pela camada de verificação, que o lê da mesma tabela e não depende da inferência, o que torna contável, no registro, cada correção que a verificação impõe.</w:t>
+        <w:t xml:space="preserve">A saída é expressa em degraus de classe: zero corresponde à classe da via, um à classe imediatamente inferior e dois à classe mínima admitida para dimerização. Os três conjuntos de saída são simétricos em torno de cada degrau, de modo que uma regra ativada isoladamente produz exatamente a classe correspondente, e a combinação de regras, um degrau intermediário. O degrau é convertido em fração contínua do fluxo pleno por interpolação linear entre as iluminâncias das classes, lidas </w:t>
+      </w:r>
+      <w:r>
+        <w:rPr>
+          <w:lang w:val="pt-BR"/>
+        </w:rPr>
+        <w:lastRenderedPageBreak/>
+        <w:t>da tabela de classes (RF09): para a classe P3, os degraus valem 1,0, 0,75 e 0,5 do pleno, isto é, as classes P3, P4 e P5 do Quadro 8, e nenhum desses valores reside no código. Classes com menos degraus disponíveis os repetem, e uma classe não dimerizável permanece sempre no pleno. O piso continua a ser imposto pela camada de verificação, que o lê da mesma tabela e não depende da inferência, o que torna contável, no registro, cada correção que a verificação impõe.</w:t>
       </w:r>
     </w:p>
     <w:p>
@@ -17331,13 +17384,14 @@
         <w:rPr>
           <w:lang w:val="pt-BR"/>
         </w:rPr>
-        <w:t xml:space="preserve">O método é o de Mamdani na forma usual: conjunção e implicação pelo mínimo, agregação pelo máximo e defuzificação pelo centroide (MAMDANI; ASSILIAN, 1975). A base vigente tem sete regras. Três mantêm a classe da via: a ocorrência reportada, a movimentação observada alta e a movimentação prevista alta, por antecipação. </w:t>
-      </w:r>
-      <w:r>
-        <w:rPr>
-          <w:lang w:val="pt-BR"/>
-        </w:rPr>
-        <w:t>Quatro descem de classe, e todas exigem ausência de ocorrência: a movimentação observada média conduz a uma classe abaixo; a observada baixa com previsão baixa, à classe mínima; a observada baixa com previsão média, a uma classe abaixo; e a observada baixa no início da noite, a uma classe abaixo, como evidência de apoio. A evidência de risco não é diluída na agregação por uma regra de redução ativa ao mesmo tempo — restrição deliberada de interpretabilidade, na linha de Pickering, Cohen e De Baets (2026). A faixa horária é medida em horas desde as 18 h e dividida em início da noite, madrugada e pré-amanhecer. Se nenhuma regra for ativada, o nível pretendido é o pleno; com a base vigente, isso ocorre apenas quando falta o volume do trecho, porque falta de informação nunca produz atenuação. Qualquer alteração da base gera nova versão, identificada pelo conteúdo do arquivo, e cada decisão registra a versão que a produziu. A base vigente sucede duas versões. A primeira, de oito regras, já decidia pelo volume, mas exprimia a saída em frações fixas do pleno, que não correspondiam a classe alguma. A segunda levava ao pleno qualquer pedestre presente e foi abandonada por ir além da norma: a classe mínima admitida é, ela própria, classe de pedestres, com iluminância vertical mínima destinada ao reconhecimento facial (Quadro 8), de modo que uma pessoa numa via de pouco movimento está atendida nela, e exigir o pleno retirava da atenuação o seu sentido. Depois, a troca da série de treino (3.6) mudou os tercis e a largura das rampas, sem mudar as sete regras. Cada decisão grava ainda as entradas da inferência e o grau com que cada regra foi ativada, o que permite explicá-la regra a regra.</w:t>
+        <w:t xml:space="preserve">O método é o de Mamdani na forma usual: conjunção e implicação pelo mínimo, agregação pelo máximo e defuzificação pelo centroide (MAMDANI; ASSILIAN, 1975). A base vigente tem sete regras. Três mantêm a classe da via: a ocorrência reportada, a movimentação observada alta e a movimentação prevista alta, por antecipação. Quatro descem de classe, e todas exigem ausência de ocorrência: a movimentação observada média conduz a uma classe abaixo; a observada baixa com previsão baixa, à classe mínima; a observada baixa com previsão média, a uma classe abaixo; e a observada baixa no início da noite, a uma classe abaixo, como evidência de apoio. A evidência de risco não é diluída na agregação por uma regra de redução ativa ao mesmo tempo — restrição deliberada de interpretabilidade, na linha de Pickering, Cohen e De Baets (2026). A faixa horária é medida em horas desde as 18 h e dividida em início da noite, madrugada e pré-amanhecer. Se nenhuma regra for ativada, o nível pretendido é o pleno; com a base vigente, isso ocorre apenas quando falta o volume do trecho, porque falta de informação nunca produz atenuação. Qualquer alteração da base gera nova versão, identificada pelo conteúdo do arquivo, e cada decisão registra a versão que a produziu. A base vigente sucede duas versões. A primeira, de oito regras, já decidia pelo volume, mas exprimia a saída em frações fixas do pleno, que não correspondiam a classe alguma. A segunda levava ao pleno qualquer pedestre presente e foi abandonada por ir além da norma: a classe mínima admitida é, ela própria, classe de pedestres, com iluminância vertical mínima destinada ao reconhecimento facial (Quadro 8), de modo que uma pessoa numa via de pouco movimento está atendida nela, e exigir o pleno retirava da atenuação o seu sentido. Depois, a troca da série de treino (3.6) mudou os tercis e a largura das rampas, sem </w:t>
+      </w:r>
+      <w:r>
+        <w:rPr>
+          <w:lang w:val="pt-BR"/>
+        </w:rPr>
+        <w:lastRenderedPageBreak/>
+        <w:t>mudar as sete regras. Cada decisão grava ainda as entradas da inferência e o grau com que cada regra foi ativada, o que permite explicá-la regra a regra.</w:t>
       </w:r>
     </w:p>
     <w:p>
@@ -17369,13 +17423,7 @@
         <w:rPr>
           <w:lang w:val="pt-BR"/>
         </w:rPr>
-        <w:t xml:space="preserve">A composição das regras oferece também proteção contra erro de contagem da plataforma. Um volume baixo não basta para levar o nível à classe mínima: se a movimentação prevista para o trecho for alta, a regra de antecipação mantém a classe da via; se for média, o nível permanece uma classe abaixo; só com a previsão também baixa a atenuação se completa. A previsão opera, assim, como segunda evidência, </w:t>
-      </w:r>
-      <w:r>
-        <w:rPr>
-          <w:lang w:val="pt-BR"/>
-        </w:rPr>
-        <w:t>independente da contagem do período, e a atenuação máxima exige que as duas concordem. A precisão da contagem produzida pela plataforma não é avaliada neste trabalho; o que a arquitetura assegura é que um erro dessa contagem resulte, no pior caso, em nível dentro da faixa admitida pela norma, alcançado sob a rampa normativa. Essa função é medida em 3.9, com a contagem falhando deliberadamente, e o Capítulo 4 reporta também o que ocorre quando a previsão vem de uma média sazonal, em lugar do modelo treinado.</w:t>
+        <w:t>A composição das regras oferece também proteção contra erro de contagem da plataforma. Um volume baixo não basta para levar o nível à classe mínima: se a movimentação prevista para o trecho for alta, a regra de antecipação mantém a classe da via; se for média, o nível permanece uma classe abaixo; só com a previsão também baixa a atenuação se completa. A previsão opera, assim, como segunda evidência, independente da contagem do período, e a atenuação máxima exige que as duas concordem. A precisão da contagem produzida pela plataforma não é avaliada neste trabalho; o que a arquitetura assegura é que um erro dessa contagem resulte, no pior caso, em nível dentro da faixa admitida pela norma, alcançado sob a rampa normativa. Essa função é medida em 3.9, com a contagem falhando deliberadamente, e o Capítulo 4 reporta também o que ocorre quando a previsão vem de uma média sazonal, em lugar do modelo treinado.</w:t>
       </w:r>
     </w:p>
     <w:p>
@@ -17391,7 +17439,14 @@
         <w:rPr>
           <w:lang w:val="pt-BR"/>
         </w:rPr>
-        <w:t>A escolha foi confrontada com a alternativa mais simples: a mesma base, com os mesmos tercis, operando como tabela em degraus, sem pertinência parcial. Na suíte de cenários, as duas empatam em segurança, aderência ao envelope e energia. A diferença aparece quando o volume oscila em torno de uma fronteira: a tabela salta entre classes em degraus inteiros, e a inferência nebulosa responde com ajustes menores e mais frequentes. O trabalho não fundamenta a escolha em economia de energia; fundamenta-a na legibilidade da base, com os números reportados no Capítulo 4. A comparação foi depois repetida em seis cenários construídos só para essa região, com o volume sorteado em torno de cada tercil e critério fixado antes da execução: a inferência nebulosa só seria considerada não substituível se apresentasse, ao mesmo tempo, menor variação total e menos inversões de sentido que a tabela. Não apresentou: reduziu a variação total e os saltos bruscos, e inverteu o sentido mais vezes (4.6). O trabalho declara, por isso, que a pertinência parcial é a forma de expressão e de execução da base de regras, com efeito medido na suavidade da resposta, e não componente cuja retirada degrade a segurança ou o consumo. Um último confronto empregou noites reais com contagem de 15 min, contou apenas as mudanças de nível perceptíveis e incluiu uma tabela com histerese de descida; também nele a inferência nebulosa não superou as tabelas (4.6).</w:t>
+        <w:t xml:space="preserve">A escolha foi confrontada com a alternativa mais simples: a mesma base, com os mesmos tercis, operando como tabela em degraus, sem pertinência parcial. Na suíte de cenários, as duas empatam em segurança, aderência ao envelope e energia. A diferença aparece quando o volume oscila em torno de uma fronteira: a tabela salta entre classes em degraus inteiros, e a inferência nebulosa responde com ajustes menores e mais frequentes. O trabalho não fundamenta a escolha em economia de energia; fundamenta-a na legibilidade da base, com os números reportados no Capítulo 4. A comparação foi depois repetida em seis cenários construídos só para essa região, com o volume sorteado em torno de cada tercil e critério fixado antes da execução: a inferência nebulosa só seria considerada não substituível se apresentasse, ao mesmo tempo, menor variação total e menos inversões de sentido que a tabela. Não apresentou: reduziu a variação total e os saltos bruscos, e inverteu </w:t>
+      </w:r>
+      <w:r>
+        <w:rPr>
+          <w:lang w:val="pt-BR"/>
+        </w:rPr>
+        <w:lastRenderedPageBreak/>
+        <w:t>o sentido mais vezes (4.6). O trabalho declara, por isso, que a pertinência parcial é a forma de expressão e de execução da base de regras, com efeito medido na suavidade da resposta, e não componente cuja retirada degrade a segurança ou o consumo. Um último confronto empregou noites reais com contagem de 15 min, contou apenas as mudanças de nível perceptíveis e incluiu uma tabela com histerese de descida; também nele a inferência nebulosa não superou as tabelas (4.6).</w:t>
       </w:r>
     </w:p>
     <w:p>
@@ -17447,13 +17502,7 @@
         <w:rPr>
           <w:lang w:val="pt-BR"/>
         </w:rPr>
-        <w:t xml:space="preserve">Taxa de variação: a transição entre o nível corrente e o nível decidido é rampeada de modo a não exceder a taxa máxima de decréscimo </w:t>
-      </w:r>
-      <w:r>
-        <w:rPr>
-          <w:lang w:val="pt-BR"/>
-        </w:rPr>
-        <w:t>estabelecida pela norma. O restabelecimento do fluxo não está sujeito a essa limitação, o que é coerente com a função de segurança da iluminação. A rampa é executada pelo nó, a partir do nível que ele de fato aplica, um passo a cada 5 s, com queda de 0,008 do fluxo pleno por passo, a taxa arredondada para baixo, o que respeita por construção o limite de um décimo por minuto. O serviço verifica o piso do nível-alvo e envia, com o comando, o piso e a taxa da classe; o nó aplica a mesma regra de cálculo, com os mesmos arredondamentos, e não desce abaixo do piso recebido, o que torna a verificação de piso dupla, no serviço e no nó.</w:t>
+        <w:t>Taxa de variação: a transição entre o nível corrente e o nível decidido é rampeada de modo a não exceder a taxa máxima de decréscimo estabelecida pela norma. O restabelecimento do fluxo não está sujeito a essa limitação, o que é coerente com a função de segurança da iluminação. A rampa é executada pelo nó, a partir do nível que ele de fato aplica, um passo a cada 5 s, com queda de 0,008 do fluxo pleno por passo, a taxa arredondada para baixo, o que respeita por construção o limite de um décimo por minuto. O serviço verifica o piso do nível-alvo e envia, com o comando, o piso e a taxa da classe; o nó aplica a mesma regra de cálculo, com os mesmos arredondamentos, e não desce abaixo do piso recebido, o que torna a verificação de piso dupla, no serviço e no nó.</w:t>
       </w:r>
     </w:p>
     <w:p>
@@ -17469,7 +17518,14 @@
         <w:rPr>
           <w:lang w:val="pt-BR"/>
         </w:rPr>
-        <w:t>O serviço verifica o piso: o nível-alvo emitido é o maior entre o pretendido e o piso, e registra-se como restrição aplicada o piso, quando houve correção, ou nenhuma. O valor taxa permanece no domínio da restrição para os registros anteriores à arquitetura de 3.5.2, em que o serviço conduzia a rampa. A taxa é aplicada pelo nó, a cada passo, pela mesma regra de cálculo (3.4). A camada é, por construção, não decrescente em relação ao nível pretendido — nunca devolve nível menor que o pedido pela inferência —, e essa propriedade é conferida a cada decisão, e não apenas afirmada. O nível é representado com três casas decimais, do serviço ao banco, e os arredondamentos são sempre no sentido seguro: o piso para cima e a queda admitida para baixo. A taxa, prescrita pela norma de forma geral e não por classe, é gravada como atributo de cada classe, conforme o Quadro 16.</w:t>
+        <w:t xml:space="preserve">O serviço verifica o piso: o nível-alvo emitido é o maior entre o pretendido e o piso, e registra-se como restrição aplicada o piso, quando houve correção, ou nenhuma. O valor taxa permanece no domínio da restrição para os registros anteriores à arquitetura de 3.5.2, em que o serviço conduzia a rampa. A taxa é aplicada pelo nó, a cada passo, pela mesma regra de cálculo (3.4). A camada é, por construção, não decrescente em relação ao nível pretendido — nunca devolve nível menor que o pedido pela inferência —, e essa propriedade é conferida a cada decisão, e não apenas afirmada. O nível é representado com três casas decimais, do serviço ao banco, e os arredondamentos são sempre no sentido seguro: o piso para cima e a </w:t>
+      </w:r>
+      <w:r>
+        <w:rPr>
+          <w:lang w:val="pt-BR"/>
+        </w:rPr>
+        <w:lastRenderedPageBreak/>
+        <w:t>queda admitida para baixo. A taxa, prescrita pela norma de forma geral e não por classe, é gravada como atributo de cada classe, conforme o Quadro 16.</w:t>
       </w:r>
     </w:p>
     <w:p>
@@ -17501,13 +17557,7 @@
         <w:rPr>
           <w:lang w:val="pt-BR"/>
         </w:rPr>
-        <w:t xml:space="preserve">A mesma lógica é estendida ao serviço. O volume publicado vale por 15 min, três períodos de publicação; vencido sem renovação, o serviço decide o nível pleno na varredura seguinte e o publica, de modo que a ausência de dado fica registrada como decisão, e não desaparece da auditoria; o comando anterior, cuja validade acompanha a do volume, já terá levado o nó ao pleno. A ocorrência vale até que a plataforma publique o seu encerramento ou até vencer a vigência informada, o que </w:t>
-      </w:r>
-      <w:r>
-        <w:rPr>
-          <w:lang w:val="pt-BR"/>
-        </w:rPr>
-        <w:t>vier primeiro; em cada trecho, prevalece a publicação mais recente de cada tipo. Falta de informação nunca produz atenuação.</w:t>
+        <w:t>A mesma lógica é estendida ao serviço. O volume publicado vale por 15 min, três períodos de publicação; vencido sem renovação, o serviço decide o nível pleno na varredura seguinte e o publica, de modo que a ausência de dado fica registrada como decisão, e não desaparece da auditoria; o comando anterior, cuja validade acompanha a do volume, já terá levado o nó ao pleno. A ocorrência vale até que a plataforma publique o seu encerramento ou até vencer a vigência informada, o que vier primeiro; em cada trecho, prevalece a publicação mais recente de cada tipo. Falta de informação nunca produz atenuação.</w:t>
       </w:r>
     </w:p>
     <w:p>
@@ -17556,7 +17606,14 @@
         <w:rPr>
           <w:lang w:val="pt-BR"/>
         </w:rPr>
-        <w:t>A verificação de conformidade exige a fixação prévia de uma classe, determinada pelo procedimento da ABNT NBR 5101 e não arbitrada. Adota-se como cenário de referência a calçada de via urbana local, para a qual os parâmetros normativos assumem os seguintes valores: velocidade baixa, inferior a 30 km/h; volume de tráfego moderado; composição com pedestres e veículos motorizados; presença de veículos estacionados; e luminância de ambiente moderada. A soma dos fatores de ponderação conduz, pela equação normativa de seleção, à classe P3.</w:t>
+        <w:t xml:space="preserve">A verificação de conformidade exige a fixação prévia de uma classe, determinada pelo procedimento da ABNT NBR 5101 e não arbitrada. Adota-se como cenário de referência a calçada de via urbana local, para a qual os parâmetros normativos assumem os seguintes valores: velocidade baixa, inferior a 30 km/h; volume de tráfego moderado; composição com pedestres e veículos motorizados; </w:t>
+      </w:r>
+      <w:r>
+        <w:rPr>
+          <w:lang w:val="pt-BR"/>
+        </w:rPr>
+        <w:lastRenderedPageBreak/>
+        <w:t>presença de veículos estacionados; e luminância de ambiente moderada. A soma dos fatores de ponderação conduz, pela equação normativa de seleção, à classe P3.</w:t>
       </w:r>
     </w:p>
     <w:p>
@@ -18251,6 +18308,7 @@
         <w:rPr>
           <w:lang w:val="pt-BR"/>
         </w:rPr>
+        <w:lastRenderedPageBreak/>
         <w:t xml:space="preserve">Etapa 4 — Verificação do invariante de segurança. Submete-se o sistema à suíte de cenários e verifica-se, para cada decisão emitida, se algum dos dois limites normativos foi transgredido. A avaliação é exaustiva e o critério é categórico: nenhuma violação é admitida. Incluem-se cenários adversariais, construídos para induzir a inferência a produzir decisão inadmissível, de modo que a verificação seja submetida a esforço e não apenas exercitada. Os cenários correm em relógio virtual, com passo igual ao da rampa do nó, de 5 s, o que torna a suíte repetível e rápida sem alterar a rampa, que continua limitada a um décimo por minuto; o serviço decide e publica como em operação (3.5.2), e um nó virtual, com a mesma regra do nó físico, produz o nível de cada passo, sobre o qual se contam as violações; cada execução enxerga apenas os eventos que ela própria publicou. </w:t>
       </w:r>
       <w:proofErr w:type="spellStart"/>
@@ -18292,13 +18350,7 @@
         <w:rPr>
           <w:lang w:val="pt-BR"/>
         </w:rPr>
-        <w:t xml:space="preserve">Etapa 5 — Medição do percurso físico e verificação do diagnóstico. Para um conjunto de transições de nível, mede-se a latência entre a publicação </w:t>
-      </w:r>
-      <w:r>
-        <w:rPr>
-          <w:lang w:val="pt-BR"/>
-        </w:rPr>
-        <w:t xml:space="preserve">do dado na interface e a estabilização da iluminância no valor correspondente, reportada como distribuição sobre repetições independentes, com o número de repetições explicitado. A latência medida vai da publicação do evento à chegada da telemetria e inclui, portanto, a leitura de confirmação do sensor, posterior à aplicação do ciclo de trabalho; é, assim, limite superior da grandeza do RNF03. Na mesma bancada verificam-se as funções de diagnóstico descritas em 3.4.5, com a falha do ponto de luz induzida deliberadamente e a divergência entre o nível comandado e o entregue apurada ao longo dos cenários. </w:t>
+        <w:t xml:space="preserve">Etapa 5 — Medição do percurso físico e verificação do diagnóstico. Para um conjunto de transições de nível, mede-se a latência entre a publicação do dado na interface e a estabilização da iluminância no valor correspondente, reportada como distribuição sobre repetições independentes, com o número de repetições explicitado. A latência medida vai da publicação do evento à chegada da telemetria e inclui, portanto, a leitura de confirmação do sensor, posterior à aplicação do ciclo de trabalho; é, assim, limite superior da grandeza do RNF03. Na mesma bancada verificam-se as funções de diagnóstico descritas em 3.4.5, com a falha do ponto de luz induzida deliberadamente e a divergência entre o nível comandado e o entregue apurada ao longo dos cenários. </w:t>
       </w:r>
       <w:proofErr w:type="spellStart"/>
       <w:r>
@@ -18391,7 +18443,14 @@
         <w:rPr>
           <w:lang w:val="pt-BR"/>
         </w:rPr>
-        <w:t>Etapa 7 — Estimativa de consumo e comparação de regimes. Integra-se a trajetória de ciclo de trabalho registrada em cada cenário, calcula-se a energia estimada para o regime adaptativo e para as duas linhas de base e reporta-se, ao lado de cada valor, a aderência ao envelope esperado, conforme 3.11. Produz o objetivo específico i).</w:t>
+        <w:t xml:space="preserve">Etapa 7 — Estimativa de consumo e comparação de regimes. Integra-se a trajetória de ciclo de trabalho registrada em cada cenário, calcula-se a </w:t>
+      </w:r>
+      <w:r>
+        <w:rPr>
+          <w:lang w:val="pt-BR"/>
+        </w:rPr>
+        <w:lastRenderedPageBreak/>
+        <w:t>energia estimada para o regime adaptativo e para as duas linhas de base e reporta-se, ao lado de cada valor, a aderência ao envelope esperado, conforme 3.11. Produz o objetivo específico i).</w:t>
       </w:r>
     </w:p>
     <w:p>
@@ -18439,7 +18498,14 @@
         <w:rPr>
           <w:lang w:val="pt-BR"/>
         </w:rPr>
-        <w:t>Às métricas anteriores acrescentam-se quatro. A primeira é o déficit: os minutos em que o nível fica mais de 0,02 abaixo do que a situação pede — a classe da via, sob ocorrência ou volume alto, e uma classe abaixo, sob volume médio, pelo critério dos tercis de 3.7. A segunda é o acerto da contenção: dos ciclos em que a previsão mantém o nível acima do modo reativo, a fração em que o volume real da hora seguinte saiu da faixa baixa. A terceira é a luz perdida pela falha de contagem, diferença média de nível entre o cenário sem falha e o cenário com falha. A quarta descreve a forma da resposta: variação total do nível, inversões de sentido e subidas de ao menos 0,1 em um passo. A série de Zurique é de 15 min, e nesses cenários o volume de 5 min repete o valor do bloco, limitação que 5.3 registra. A linha de base de horário fixo é avaliada no horário local do ponto de luz. O Apêndice B indica, para cada resultado, o programa, os dados e o comando que o reproduzem.</w:t>
+        <w:t xml:space="preserve">Às métricas anteriores acrescentam-se quatro. A primeira é o déficit: os minutos em que o nível fica mais de 0,02 abaixo do que a situação pede — a classe da via, sob ocorrência ou volume alto, e uma classe abaixo, sob volume médio, pelo critério dos tercis de 3.7. A segunda é o acerto da contenção: dos ciclos em que a previsão </w:t>
+      </w:r>
+      <w:r>
+        <w:rPr>
+          <w:lang w:val="pt-BR"/>
+        </w:rPr>
+        <w:lastRenderedPageBreak/>
+        <w:t>mantém o nível acima do modo reativo, a fração em que o volume real da hora seguinte saiu da faixa baixa. A terceira é a luz perdida pela falha de contagem, diferença média de nível entre o cenário sem falha e o cenário com falha. A quarta descreve a forma da resposta: variação total do nível, inversões de sentido e subidas de ao menos 0,1 em um passo. A série de Zurique é de 15 min, e nesses cenários o volume de 5 min repete o valor do bloco, limitação que 5.3 registra. A linha de base de horário fixo é avaliada no horário local do ponto de luz. O Apêndice B indica, para cada resultado, o programa, os dados e o comando que o reproduzem.</w:t>
       </w:r>
     </w:p>
     <w:p>
@@ -18455,13 +18521,7 @@
         <w:rPr>
           <w:lang w:val="pt-BR"/>
         </w:rPr>
-        <w:t xml:space="preserve">Um último confronto trata só da forma da resposta, com dado real de resolução sub-horária. São oito noites reais da série de 15 min de Zurique (3.6), do ano de teste, de quatro pontos em sorteio próprio, distinto do da avaliação anterior, e três concorrentes com a mesma previsão e as mesmas regras: a inferência nebulosa, a tabela em degraus e uma tabela com histerese de descida, que sobe de faixa no tercil, na hora, e só desce quando o volume cai 0,05 abaixo dele — a correção simples que se aplicaria à tabela. Conta-se o número de passos do ciclo em que o nível emitido </w:t>
-      </w:r>
-      <w:r>
-        <w:rPr>
-          <w:lang w:val="pt-BR"/>
-        </w:rPr>
-        <w:t>varia, em relação ao anterior, ao menos um limiar de percepção. O protocolo fixou dois limiares, de 15 % e de 6 %. Conferidas as fontes depois da execução, só o de 6 % tem apoio direto na literatura: é o valor acima do qual um aumento de iluminância é percebido por observador atento (SHIKAKURA; MORIKAWA; NAKAMURA, 2003). Reporta-se também, como conferência posterior, o de 30 %, que a mesma fonte indica para observador ocupado em tarefa. O estudo foi conduzido em ambiente de escritório, com iluminâncias muito superiores às de uma via; não se localizou valor medido para via pública. O critério, fixado antes da execução, considera a inferência nebulosa não substituível se apresentar ao menos 20 % menos mudanças perceptíveis que a melhor das tabelas, nos dois limiares, sem consumir mais de 2 pontos percentuais de energia além dela e sem mais minutos abaixo do nível pedido. Nesses cenários a previsão é a do modelo em operação, e ela é a mesma para os três concorrentes.</w:t>
+        <w:t>Um último confronto trata só da forma da resposta, com dado real de resolução sub-horária. São oito noites reais da série de 15 min de Zurique (3.6), do ano de teste, de quatro pontos em sorteio próprio, distinto do da avaliação anterior, e três concorrentes com a mesma previsão e as mesmas regras: a inferência nebulosa, a tabela em degraus e uma tabela com histerese de descida, que sobe de faixa no tercil, na hora, e só desce quando o volume cai 0,05 abaixo dele — a correção simples que se aplicaria à tabela. Conta-se o número de passos do ciclo em que o nível emitido varia, em relação ao anterior, ao menos um limiar de percepção. O protocolo fixou dois limiares, de 15 % e de 6 %. Conferidas as fontes depois da execução, só o de 6 % tem apoio direto na literatura: é o valor acima do qual um aumento de iluminância é percebido por observador atento (SHIKAKURA; MORIKAWA; NAKAMURA, 2003). Reporta-se também, como conferência posterior, o de 30 %, que a mesma fonte indica para observador ocupado em tarefa. O estudo foi conduzido em ambiente de escritório, com iluminâncias muito superiores às de uma via; não se localizou valor medido para via pública. O critério, fixado antes da execução, considera a inferência nebulosa não substituível se apresentar ao menos 20 % menos mudanças perceptíveis que a melhor das tabelas, nos dois limiares, sem consumir mais de 2 pontos percentuais de energia além dela e sem mais minutos abaixo do nível pedido. Nesses cenários a previsão é a do modelo em operação, e ela é a mesma para os três concorrentes.</w:t>
       </w:r>
     </w:p>
     <w:p>
@@ -18477,7 +18537,14 @@
         <w:rPr>
           <w:lang w:val="pt-BR"/>
         </w:rPr>
-        <w:t>Cabe explicitar a natureza do envelope de decisão esperado e a limitação que dele decorre. O envelope é o intervalo de níveis considerados aceitáveis para cada cenário, definido pelos autores antes da avaliação e derivado, sempre que possível, das prescrições normativas e da literatura. Onde essa derivação não é possível, o envelope reflete julgamento dos autores, e a avaliação mede, nesses casos, a coerência entre a base de regras e esse julgamento — não a correção da decisão em sentido absoluto. A declaração é necessária porque a alternativa, calar sobre a origem do envelope, apresentaria como validação externa aquilo que é, em parte, consistência interna.</w:t>
+        <w:t xml:space="preserve">Cabe explicitar a natureza do envelope de decisão esperado e a limitação que dele decorre. O envelope é o intervalo de níveis considerados aceitáveis para cada cenário, definido pelos autores antes da avaliação e derivado, sempre que possível, das prescrições normativas e da literatura. Onde essa derivação não é possível, o envelope reflete julgamento dos autores, e a avaliação mede, nesses casos, a </w:t>
+      </w:r>
+      <w:r>
+        <w:rPr>
+          <w:lang w:val="pt-BR"/>
+        </w:rPr>
+        <w:lastRenderedPageBreak/>
+        <w:t>coerência entre a base de regras e esse julgamento — não a correção da decisão em sentido absoluto. A declaração é necessária porque a alternativa, calar sobre a origem do envelope, apresentaria como validação externa aquilo que é, em parte, consistência interna.</w:t>
       </w:r>
     </w:p>
     <w:p>
@@ -18678,7 +18745,14 @@
         <w:rPr>
           <w:lang w:val="pt-BR"/>
         </w:rPr>
-        <w:t>Registra-se que a plataforma tomada como referência de infraestrutura opera tecnologias de reconhecimento facial e de leitura de placas, que constituem tratamento de dado pessoal sujeito à Lei Geral de Proteção de Dados Pessoais (BRASIL, 2018). O presente trabalho não acessa, não reproduz e não depende dessas funcionalidades: a informação que o sistema consome é a descrição agregada do estado da via. Essa distinção é relevante também para a proposta de integração: o que se propõe consumir é o alerta de evento e a contagem agregada, e não o conteúdo de imagem ou a identificação de pessoas. Uma integração efetiva exigiria tratamento jurídico próprio, registrado entre as limitações.</w:t>
+        <w:t xml:space="preserve">Registra-se que a plataforma tomada como referência de infraestrutura opera tecnologias de reconhecimento facial e de leitura de placas, que constituem </w:t>
+      </w:r>
+      <w:r>
+        <w:rPr>
+          <w:lang w:val="pt-BR"/>
+        </w:rPr>
+        <w:lastRenderedPageBreak/>
+        <w:t>tratamento de dado pessoal sujeito à Lei Geral de Proteção de Dados Pessoais (BRASIL, 2018). O presente trabalho não acessa, não reproduz e não depende dessas funcionalidades: a informação que o sistema consome é a descrição agregada do estado da via. Essa distinção é relevante também para a proposta de integração: o que se propõe consumir é o alerta de evento e a contagem agregada, e não o conteúdo de imagem ou a identificação de pessoas. Uma integração efetiva exigiria tratamento jurídico próprio, registrado entre as limitações.</w:t>
       </w:r>
     </w:p>
     <w:p>
@@ -18694,13 +18768,7 @@
         <w:rPr>
           <w:lang w:val="pt-BR"/>
         </w:rPr>
-        <w:t xml:space="preserve">O risco de desvio de finalidade não é hipotético, e há caso documentado que convém registrar. Em San Diego, nos Estados Unidos, cerca de três mil e trezentos postes receberam sensores e câmeras cuja finalidade principal declarada era coletar dados para a gestão da cidade, e não o policiamento. A partir de agosto de 2018 o departamento de polícia passou a acessar as imagens, chegando a quase quatrocentos acessos até meados de 2020, sob alegação de crimes graves, lista que incluía vandalismo e descarte irregular de resíduos; a reação pública levou a pedidos de moratória e a uma proposta de norma municipal de vigilância, ainda em discussão em meados de 2020 (PERRY, 2020). O episódio é a razão pela qual a fronteira entre </w:t>
-      </w:r>
-      <w:r>
-        <w:rPr>
-          <w:lang w:val="pt-BR"/>
-        </w:rPr>
-        <w:t>dado agregado e dado de identificação, neste trabalho, é requisito de interface e não recomendação de uso.</w:t>
+        <w:t>O risco de desvio de finalidade não é hipotético, e há caso documentado que convém registrar. Em San Diego, nos Estados Unidos, cerca de três mil e trezentos postes receberam sensores e câmeras cuja finalidade principal declarada era coletar dados para a gestão da cidade, e não o policiamento. A partir de agosto de 2018 o departamento de polícia passou a acessar as imagens, chegando a quase quatrocentos acessos até meados de 2020, sob alegação de crimes graves, lista que incluía vandalismo e descarte irregular de resíduos; a reação pública levou a pedidos de moratória e a uma proposta de norma municipal de vigilância, ainda em discussão em meados de 2020 (PERRY, 2020). O episódio é a razão pela qual a fronteira entre dado agregado e dado de identificação, neste trabalho, é requisito de interface e não recomendação de uso.</w:t>
       </w:r>
     </w:p>
     <w:p>
@@ -18749,7 +18817,14 @@
         <w:rPr>
           <w:lang w:val="pt-BR"/>
         </w:rPr>
-        <w:t>A avaliação energética não emprega instrumentação elétrica: emprega o registro que o sistema já produz. A fita de LED adotada declara potência por unidade de comprimento, e o comprimento do segmento é fixado por medição conforme 3.4.2, de modo que a potência a ciclo de trabalho pleno é conhecida. O nível aplicado em cada passo da rampa é registrado pelo nó na sua saída serial, e o ciclo de trabalho correspondente decorre da tabela de calibração; a telemetria, gravada conforme o modelo de dados de 3.13.1, só ocorre quando chega um comando e não cobre os passos intermediários. A energia consumida em um cenário é, então, a soma dos produtos entre a potência plena, o ciclo de trabalho de cada intervalo e a duração desse intervalo.</w:t>
+        <w:t xml:space="preserve">A avaliação energética não emprega instrumentação elétrica: emprega o registro que o sistema já produz. A fita de LED adotada declara potência por unidade </w:t>
+      </w:r>
+      <w:r>
+        <w:rPr>
+          <w:lang w:val="pt-BR"/>
+        </w:rPr>
+        <w:lastRenderedPageBreak/>
+        <w:t>de comprimento, e o comprimento do segmento é fixado por medição conforme 3.4.2, de modo que a potência a ciclo de trabalho pleno é conhecida. O nível aplicado em cada passo da rampa é registrado pelo nó na sua saída serial, e o ciclo de trabalho correspondente decorre da tabela de calibração; a telemetria, gravada conforme o modelo de dados de 3.13.1, só ocorre quando chega um comando e não cobre os passos intermediários. A energia consumida em um cenário é, então, a soma dos produtos entre a potência plena, o ciclo de trabalho de cada intervalo e a duração desse intervalo.</w:t>
       </w:r>
     </w:p>
     <w:p>
@@ -18765,13 +18840,7 @@
         <w:rPr>
           <w:lang w:val="pt-BR"/>
         </w:rPr>
-        <w:t xml:space="preserve">A hipótese que sustenta o cálculo é a proporcionalidade entre o ciclo de trabalho e a potência média consumida, e ela é adequada ao arranjo adotado: a modulação por largura de pulso chaveia a corrente plena do segmento, de modo que a potência média é o produto da potência em condução pela fração de tempo em que há condução. A mesma proporcionalidade vale, aproximadamente, para o fluxo luminoso, o que oferece verificação cruzada útil — a estimativa derivada do ciclo comandado pode ser confrontada com a derivada da iluminância medida, e a divergência entre as duas é reportada junto ao resultado. A comparação entre as duas </w:t>
-      </w:r>
-      <w:r>
-        <w:rPr>
-          <w:lang w:val="pt-BR"/>
-        </w:rPr>
-        <w:t>estimativas é também exibida em tempo real no painel, calculada pelo mesmo módulo que produz os resultados do Capítulo 4.</w:t>
+        <w:t>A hipótese que sustenta o cálculo é a proporcionalidade entre o ciclo de trabalho e a potência média consumida, e ela é adequada ao arranjo adotado: a modulação por largura de pulso chaveia a corrente plena do segmento, de modo que a potência média é o produto da potência em condução pela fração de tempo em que há condução. A mesma proporcionalidade vale, aproximadamente, para o fluxo luminoso, o que oferece verificação cruzada útil — a estimativa derivada do ciclo comandado pode ser confrontada com a derivada da iluminância medida, e a divergência entre as duas é reportada junto ao resultado. A comparação entre as duas estimativas é também exibida em tempo real no painel, calculada pelo mesmo módulo que produz os resultados do Capítulo 4.</w:t>
       </w:r>
     </w:p>
     <w:p>
@@ -19012,6 +19081,7 @@
                 <w:sz w:val="20"/>
                 <w:szCs w:val="20"/>
               </w:rPr>
+              <w:lastRenderedPageBreak/>
               <w:t xml:space="preserve">Eficácia </w:t>
             </w:r>
             <w:proofErr w:type="spellStart"/>
@@ -19419,13 +19489,7 @@
         <w:rPr>
           <w:lang w:val="pt-BR"/>
         </w:rPr>
-        <w:t xml:space="preserve">Com a luminária de referência, a energia não precisa ser inferida da telemetria da bancada: decorre do próprio registro de decisões. Entre duas decisões consecutivas, o nível emitido segue trajetória linear por partes, imposta pela taxa máxima de decréscimo — a elevação é imediata, e a atenuação é rampeada à taxa máxima de um décimo do fluxo pleno por minuto até atingir o novo nível, no qual permanece. A integral dessa trajetória tem forma fechada. Sejam a e b os níveis anterior e novo, expressos como fração do fluxo pleno, P a potência nominal em watts e Δt o intervalo até a decisão seguinte, em minutos. Numa atenuação, a rampa dura d = (a − b)/0,1 minutos, e a energia consumida no intervalo, em watt-hora, é E = P × </w:t>
-      </w:r>
-      <w:r>
-        <w:rPr>
-          <w:lang w:val="pt-BR"/>
-        </w:rPr>
-        <w:t>[(a + b)/2 × d + b × (Δt − d)] / 60. Numa elevação, E = P × b × Δt / 60. Quando a decisão seguinte chega antes do fim da rampa, integra-se apenas o trecho percorrido. Cada decisão registrada produz, assim, um valor de energia, e a energia de um cenário é a soma desses valores. A título de ordem de grandeza, a descida completa de P3 a P5, que a norma obriga a durar ao menos cinco minutos, consome 2,50 Wh na luminária de referência, contra 3,33 Wh no mesmo intervalo em fluxo pleno.</w:t>
+        <w:t>Com a luminária de referência, a energia não precisa ser inferida da telemetria da bancada: decorre do próprio registro de decisões. Entre duas decisões consecutivas, o nível emitido segue trajetória linear por partes, imposta pela taxa máxima de decréscimo — a elevação é imediata, e a atenuação é rampeada à taxa máxima de um décimo do fluxo pleno por minuto até atingir o novo nível, no qual permanece. A integral dessa trajetória tem forma fechada. Sejam a e b os níveis anterior e novo, expressos como fração do fluxo pleno, P a potência nominal em watts e Δt o intervalo até a decisão seguinte, em minutos. Numa atenuação, a rampa dura d = (a − b)/0,1 minutos, e a energia consumida no intervalo, em watt-hora, é E = P × [(a + b)/2 × d + b × (Δt − d)] / 60. Numa elevação, E = P × b × Δt / 60. Quando a decisão seguinte chega antes do fim da rampa, integra-se apenas o trecho percorrido. Cada decisão registrada produz, assim, um valor de energia, e a energia de um cenário é a soma desses valores. A título de ordem de grandeza, a descida completa de P3 a P5, que a norma obriga a durar ao menos cinco minutos, consome 2,50 Wh na luminária de referência, contra 3,33 Wh no mesmo intervalo em fluxo pleno.</w:t>
       </w:r>
     </w:p>
     <w:p>
@@ -19441,7 +19505,14 @@
         <w:rPr>
           <w:lang w:val="pt-BR"/>
         </w:rPr>
-        <w:t>Duas observações sobre a escolha da potência. A primeira é que ela não altera a conclusão: sob a hipótese de proporcionalidade, a potência nominal multiplica igualmente o consumo do regime adaptativo e o das linhas de base, e cancela-se na razão entre eles. A luminária de referência converte a razão em watt-hora, sem modificá-la. Para que a propriedade seja verificável, e não apenas afirmada, os resultados são reportados também no extremo superior dessa faixa, 440 W, em que os valores absolutos são onze vezes maiores e a razão é idêntica. A segunda é a razão de adotar o extremo inferior: é a escolha conservadora, porque produz os menores valores absolutos de economia e é o caso em que o viés declarado ao final desta subseção pesa mais.</w:t>
+        <w:t xml:space="preserve">Duas observações sobre a escolha da potência. A primeira é que ela não altera a conclusão: sob a hipótese de proporcionalidade, a potência nominal multiplica igualmente o consumo do regime adaptativo e o das linhas de base, e cancela-se na razão entre eles. A luminária de referência converte a razão em watt-hora, sem modificá-la. Para que a propriedade seja verificável, e não apenas afirmada, os resultados são reportados também no extremo superior dessa faixa, 440 W, em que os valores absolutos são onze vezes maiores e a razão é idêntica. A segunda é a razão de adotar o extremo inferior: é a escolha conservadora, porque produz os </w:t>
+      </w:r>
+      <w:r>
+        <w:rPr>
+          <w:lang w:val="pt-BR"/>
+        </w:rPr>
+        <w:lastRenderedPageBreak/>
+        <w:t>menores valores absolutos de economia e é o caso em que o viés declarado ao final desta subseção pesa mais.</w:t>
       </w:r>
     </w:p>
     <w:p>
@@ -19489,13 +19560,7 @@
         <w:rPr>
           <w:lang w:val="pt-BR"/>
         </w:rPr>
-        <w:t xml:space="preserve">Uma advertência metodológica precede o resultado. Consumo, isoladamente, não é critério de mérito em iluminação pública: o regime de menor consumo é o de luz </w:t>
-      </w:r>
-      <w:r>
-        <w:rPr>
-          <w:lang w:val="pt-BR"/>
-        </w:rPr>
-        <w:t>apagada, e qualquer comparação que premie apenas a redução premiará o regime menos seguro. A avaliação é, por isso, conjunta, e reporta dois valores para cada regime — a energia estimada e a aderência da iluminação à demanda observada, medida como a fração dos ciclos em que o nível entregue se situou dentro do envelope esperado do cenário, nos termos de 3.9. O que o trabalho busca estabelecer não é o consumo mínimo, e sim o consumo aderente à condição observada, sem que em nenhum momento os limites da norma sejam transgredidos.</w:t>
+        <w:t>Uma advertência metodológica precede o resultado. Consumo, isoladamente, não é critério de mérito em iluminação pública: o regime de menor consumo é o de luz apagada, e qualquer comparação que premie apenas a redução premiará o regime menos seguro. A avaliação é, por isso, conjunta, e reporta dois valores para cada regime — a energia estimada e a aderência da iluminação à demanda observada, medida como a fração dos ciclos em que o nível entregue se situou dentro do envelope esperado do cenário, nos termos de 3.9. O que o trabalho busca estabelecer não é o consumo mínimo, e sim o consumo aderente à condição observada, sem que em nenhum momento os limites da norma sejam transgredidos.</w:t>
       </w:r>
     </w:p>
     <w:p>
@@ -19511,7 +19576,14 @@
         <w:rPr>
           <w:lang w:val="pt-BR"/>
         </w:rPr>
-        <w:t>Delimita-se, por fim, o alcance das duas estimativas. A de bancada vale para o arranjo em que a corrente é limitada por resistores integrados ao módulo de luz. A da luminária de referência herda a hipótese de proporcionalidade, e é nela que a hipótese pesa: a eficiência do regulador de corrente de um ponto de luz viário pode variar com o nível de saída, e há ainda uma parcela fixa no próprio regulador e no controlador de telegestão, que não se reduz com a dimerização e que não é aqui quantificada, por não haver valor público para o equipamento instalado. Os dois efeitos, se presentes, atuam no mesmo sentido — a redução de consumo real é menor que a proporcional à redução de fluxo —, e a parcela fixa pesa tanto mais quanto menor a potência nominal. A estimativa é, portanto, um limite superior otimista, e assim é reportada. Não se afirma economia anual, economia em escala de parque nem valor monetário: a suíte de cenários não constitui perfil anual de ocupação do município, e multiplicar seu resultado pelo número de pontos do parque atribuiria à suíte uma representatividade que ela não tem. A quantificação em equipamento viário, com medição elétrica rastreável, figura entre as recomendações de 6.1.</w:t>
+        <w:t xml:space="preserve">Delimita-se, por fim, o alcance das duas estimativas. A de bancada vale para o arranjo em que a corrente é limitada por resistores integrados ao módulo de luz. A da luminária de referência herda a hipótese de proporcionalidade, e é nela que a hipótese pesa: a eficiência do regulador de corrente de um ponto de luz viário pode variar com o nível de saída, e há ainda uma parcela fixa no próprio regulador e no controlador de telegestão, que não se reduz com a dimerização e que não é aqui quantificada, por não haver valor público para o equipamento instalado. Os dois efeitos, se presentes, </w:t>
+      </w:r>
+      <w:r>
+        <w:rPr>
+          <w:lang w:val="pt-BR"/>
+        </w:rPr>
+        <w:lastRenderedPageBreak/>
+        <w:t>atuam no mesmo sentido — a redução de consumo real é menor que a proporcional à redução de fluxo —, e a parcela fixa pesa tanto mais quanto menor a potência nominal. A estimativa é, portanto, um limite superior otimista, e assim é reportada. Não se afirma economia anual, economia em escala de parque nem valor monetário: a suíte de cenários não constitui perfil anual de ocupação do município, e multiplicar seu resultado pelo número de pontos do parque atribuiria à suíte uma representatividade que ela não tem. A quantificação em equipamento viário, com medição elétrica rastreável, figura entre as recomendações de 6.1.</w:t>
       </w:r>
     </w:p>
     <w:p>
@@ -19528,6 +19600,7 @@
         <w:rPr>
           <w:lang w:val="pt-BR"/>
         </w:rPr>
+        <w:lastRenderedPageBreak/>
         <w:t>3.12 Engenharia de software</w:t>
       </w:r>
       <w:bookmarkEnd w:id="43"/>
@@ -19919,6 +19992,7 @@
                 <w:sz w:val="20"/>
                 <w:szCs w:val="20"/>
               </w:rPr>
+              <w:lastRenderedPageBreak/>
               <w:t>RF03</w:t>
             </w:r>
           </w:p>
@@ -20940,6 +21014,7 @@
                 <w:sz w:val="20"/>
                 <w:szCs w:val="20"/>
               </w:rPr>
+              <w:lastRenderedPageBreak/>
               <w:t>RNF02</w:t>
             </w:r>
           </w:p>
@@ -21867,6 +21942,7 @@
         <w:rPr>
           <w:lang w:val="pt-BR"/>
         </w:rPr>
+        <w:lastRenderedPageBreak/>
         <w:t>que rege a camada de verificação: o benefício da adaptação é condicional, a garantia normativa não é.</w:t>
       </w:r>
     </w:p>
@@ -21934,19 +22010,7 @@
         <w:rPr>
           <w:lang w:val="pt-BR"/>
         </w:rPr>
-        <w:t xml:space="preserve">A </w:t>
-      </w:r>
-      <w:r>
-        <w:rPr>
-          <w:lang w:val="pt-BR"/>
-        </w:rPr>
-        <w:t xml:space="preserve">Figura 3</w:t>
-      </w:r>
-      <w:r>
-        <w:rPr>
-          <w:lang w:val="pt-BR"/>
-        </w:rPr>
-        <w:t xml:space="preserve"> apresenta o sistema em sua totalidade. O fluxo principal percorre quatro estágios encadeados, todos executados em nuvem, e termina em um quinto estágio físico: o evento urbano é publicado na interface de dados, o serviço de decisão produz a estimativa de demanda e submete o estado resultante à inferência nebulosa, a camada de verificação confronta o nível pretendido com o piso da ABNT NBR 5101 e o corrige quando necessário, o intermediário de mensagens entrega o comando já verificado e o nó de iluminação o executa sob a taxa máxima de decréscimo, devolvendo a iluminância medida. Em paralelo corre um segundo percurso, representado em tracejado: cada estágio grava no banco de dados o que recebeu e o que produziu, e é desse registro que o painel de acompanhamento se alimenta.</w:t>
+        <w:t>A Figura 3 apresenta o sistema em sua totalidade. O fluxo principal percorre quatro estágios encadeados, todos executados em nuvem, e termina em um quinto estágio físico: o evento urbano é publicado na interface de dados, o serviço de decisão produz a estimativa de demanda e submete o estado resultante à inferência nebulosa, a camada de verificação confronta o nível pretendido com o piso da ABNT NBR 5101 e o corrige quando necessário, o intermediário de mensagens entrega o comando já verificado e o nó de iluminação o executa sob a taxa máxima de decréscimo, devolvendo a iluminância medida. Em paralelo corre um segundo percurso, representado em tracejado: cada estágio grava no banco de dados o que recebeu e o que produziu, e é desse registro que o painel de acompanhamento se alimenta.</w:t>
       </w:r>
     </w:p>
     <w:p>
@@ -21964,15 +22028,8 @@
           <w:szCs w:val="20"/>
           <w:lang w:val="pt-BR"/>
         </w:rPr>
-        <w:t xml:space="preserve">Figura 3</w:t>
-      </w:r>
-      <w:r>
-        <w:rPr>
-          <w:sz w:val="20"/>
-          <w:szCs w:val="20"/>
-          <w:lang w:val="pt-BR"/>
-        </w:rPr>
-        <w:t xml:space="preserve"> – Arquitetura do sistema</w:t>
+        <w:lastRenderedPageBreak/>
+        <w:t>Figura 3 – Arquitetura do sistema</w:t>
       </w:r>
     </w:p>
     <w:p>
@@ -22005,7 +22062,7 @@
                     <pic:cNvPicPr/>
                   </pic:nvPicPr>
                   <pic:blipFill>
-                    <a:blip r:embed="rId8"/>
+                    <a:blip r:embed="rId10"/>
                     <a:stretch>
                       <a:fillRect/>
                     </a:stretch>
@@ -22089,6 +22146,7 @@
           <w:szCs w:val="20"/>
           <w:lang w:val="pt-BR"/>
         </w:rPr>
+        <w:lastRenderedPageBreak/>
         <w:t>Quadro 12 – Decisões de arquitetura</w:t>
       </w:r>
     </w:p>
@@ -22493,15 +22551,7 @@
                 <w:szCs w:val="20"/>
                 <w:lang w:val="pt-BR"/>
               </w:rPr>
-              <w:t xml:space="preserve">Sim. Banco relacional em contêiner, com as entidades do Quadro 16 e o modelo da </w:t>
-            </w:r>
-            <w:r>
-              <w:rPr>
-                <w:sz w:val="20"/>
-                <w:szCs w:val="20"/>
-                <w:lang w:val="pt-BR"/>
-              </w:rPr>
-              <w:t xml:space="preserve">Figura 7</w:t>
+              <w:t>Sim. Banco relacional em contêiner, com as entidades do Quadro 16 e o modelo da Figura 7</w:t>
             </w:r>
           </w:p>
         </w:tc>
@@ -22945,6 +22995,7 @@
           <w:szCs w:val="20"/>
           <w:lang w:val="pt-BR"/>
         </w:rPr>
+        <w:lastRenderedPageBreak/>
         <w:t>Quadro 13 – Componentes, tecnologias adotadas e responsabilidades</w:t>
       </w:r>
     </w:p>
@@ -23945,6 +23996,7 @@
         <w:rPr>
           <w:lang w:val="pt-BR"/>
         </w:rPr>
+        <w:lastRenderedPageBreak/>
         <w:t xml:space="preserve">máquina virtual em nuvem; a exceção é o painel, aplicação estática publicada à parte. Ao nó cabe executar. </w:t>
       </w:r>
       <w:r>
@@ -24080,6 +24132,7 @@
         <w:rPr>
           <w:lang w:val="pt-BR"/>
         </w:rPr>
+        <w:lastRenderedPageBreak/>
         <w:t>Ao nó cabe assinar o tópico de comando, ajustar a modulação por largura de pulso e publicar a iluminância lida. A comunicação com o intermediário ocorre sobre canal cifrado, com credencial própria do dispositivo, de modo que a identidade de cada nó seja verificável no lado do serviço. O canal é autenticado por certificado de autoridade certificadora própria, gravado no firmware, e uma regra de acesso vinculada à credencial faz com que cada nó só assine o próprio tópico de comando e só publique a própria telemetria. O serviço de decisão alcança o intermediário pela rede interna da máquina virtual, sem porta exposta, e o banco não é publicado. Na interface REST, a publicação exige chave de acesso; as consultas permanecem abertas, porque o painel apenas lê.</w:t>
       </w:r>
     </w:p>
@@ -24335,6 +24388,7 @@
                 <w:szCs w:val="20"/>
                 <w:lang w:val="pt-BR"/>
               </w:rPr>
+              <w:lastRenderedPageBreak/>
               <w:t>origem; vigência opcional. Exige chave de acesso; campo fora do contrato ou trecho fora do cadastro recusa o item, e no pacote só ele</w:t>
             </w:r>
           </w:p>
@@ -24357,6 +24411,7 @@
                 <w:sz w:val="20"/>
                 <w:szCs w:val="20"/>
               </w:rPr>
+              <w:lastRenderedPageBreak/>
               <w:t>REST – GET /</w:t>
             </w:r>
             <w:proofErr w:type="spellStart"/>
@@ -24584,7 +24639,7 @@
                 <w:szCs w:val="20"/>
                 <w:lang w:val="pt-BR"/>
               </w:rPr>
-              <w:t xml:space="preserve">Ciclo de trabalho aplicado, iluminância medida e estado do nó antes do comando, por ponto de luz</w:t>
+              <w:t>Ciclo de trabalho aplicado, iluminância medida e estado do nó antes do comando, por ponto de luz</w:t>
             </w:r>
           </w:p>
         </w:tc>
@@ -25459,15 +25514,7 @@
                 <w:szCs w:val="20"/>
                 <w:lang w:val="pt-BR"/>
               </w:rPr>
-              <w:t xml:space="preserve">Ciclo de trabalho efetivamente aplicado, nível que o nó aplicava ao responder, </w:t>
-            </w:r>
-            <w:r>
-              <w:rPr>
-                <w:sz w:val="20"/>
-                <w:szCs w:val="20"/>
-                <w:lang w:val="pt-BR"/>
-              </w:rPr>
-              <w:t xml:space="preserve">iluminância medida, nível e última iluminância lida no instante em que o comando chegou, antes de aplicá-lo, e identificador da decisão correspondente</w:t>
+              <w:t>Ciclo de trabalho efetivamente aplicado, nível que o nó aplicava ao responder, iluminância medida, nível e última iluminância lida no instante em que o comando chegou, antes de aplicá-lo, e identificador da decisão correspondente</w:t>
             </w:r>
           </w:p>
         </w:tc>
@@ -25489,6 +25536,7 @@
                 <w:sz w:val="20"/>
                 <w:szCs w:val="20"/>
               </w:rPr>
+              <w:lastRenderedPageBreak/>
               <w:t xml:space="preserve">MQTT – </w:t>
             </w:r>
             <w:proofErr w:type="spellStart"/>
@@ -25666,19 +25714,7 @@
         <w:rPr>
           <w:lang w:val="pt-BR"/>
         </w:rPr>
-        <w:t xml:space="preserve">A </w:t>
-      </w:r>
-      <w:r>
-        <w:rPr>
-          <w:lang w:val="pt-BR"/>
-        </w:rPr>
-        <w:t xml:space="preserve">Figura 4</w:t>
-      </w:r>
-      <w:r>
-        <w:rPr>
-          <w:lang w:val="pt-BR"/>
-        </w:rPr>
-        <w:t xml:space="preserve"> apresenta a sequência de mensagens de uma decisão, do recebimento do dado à exibição no painel. Os números da figura correspondem aos passos descritos em seguida.</w:t>
+        <w:t>A Figura 4 apresenta a sequência de mensagens de uma decisão, do recebimento do dado à exibição no painel. Os números da figura correspondem aos passos descritos em seguida.</w:t>
       </w:r>
     </w:p>
     <w:p>
@@ -25696,15 +25732,8 @@
           <w:szCs w:val="20"/>
           <w:lang w:val="pt-BR"/>
         </w:rPr>
-        <w:t xml:space="preserve">Figura 4</w:t>
-      </w:r>
-      <w:r>
-        <w:rPr>
-          <w:sz w:val="20"/>
-          <w:szCs w:val="20"/>
-          <w:lang w:val="pt-BR"/>
-        </w:rPr>
-        <w:t xml:space="preserve"> – Sequência de mensagens de uma decisão</w:t>
+        <w:lastRenderedPageBreak/>
+        <w:t>Figura 4 – Sequência de mensagens de uma decisão</w:t>
       </w:r>
     </w:p>
     <w:p>
@@ -25734,7 +25763,7 @@
                     <pic:cNvPicPr/>
                   </pic:nvPicPr>
                   <pic:blipFill>
-                    <a:blip r:embed="rId9"/>
+                    <a:blip r:embed="rId11"/>
                     <a:stretch>
                       <a:fillRect/>
                     </a:stretch>
@@ -25833,6 +25862,7 @@
         <w:rPr>
           <w:lang w:val="pt-BR"/>
         </w:rPr>
+        <w:lastRenderedPageBreak/>
         <w:t>(4) Decisão. O volume, dividido pela referência do trecho, torna-se o nível observado; a camada de previsão estima o nível da próxima hora (3.6); a inferência nebulosa combina os dois, a ocorrência e a faixa horária e produz o nível pretendido (3.7); a camada de verificação aplica o piso e produz o nível-alvo emitido.</w:t>
       </w:r>
     </w:p>
@@ -25897,13 +25927,7 @@
         <w:rPr>
           <w:lang w:val="pt-BR"/>
         </w:rPr>
-        <w:t xml:space="preserve">(8) Telemetria. O nó publica o ciclo de trabalho aplicado, </w:t>
-      </w:r>
-      <w:r>
-        <w:rPr>
-          <w:lang w:val="pt-BR"/>
-        </w:rPr>
-        <w:t xml:space="preserve">a iluminância medida, o estado em que estava quando o comando chegou — nível e última iluminância lida — e o identificador da decisão.</w:t>
+        <w:t>(8) Telemetria. O nó publica o ciclo de trabalho aplicado, a iluminância medida, o estado em que estava quando o comando chegou — nível e última iluminância lida — e o identificador da decisão.</w:t>
       </w:r>
     </w:p>
     <w:p>
@@ -25999,13 +26023,8 @@
         <w:rPr>
           <w:lang w:val="pt-BR"/>
         </w:rPr>
-        <w:t xml:space="preserve">O ponto de luz da bancada corresponde ao poste de placa IP0412418, de classe P3, ligado aos trechos 20159, 21198 e 22661. Com volume nulo nos três, o </w:t>
-      </w:r>
-      <w:r>
-        <w:rPr>
-          <w:lang w:val="pt-BR"/>
-        </w:rPr>
-        <w:t>nível observado foi 0, e a previsão para a próxima hora também. Sem ocorrência aberta, a inferência ativou com grau 1,0 apenas a regra de movimentação observada baixa e prevista baixa, o que resultou no degrau 2 e no nível pretendido de 0,500, a classe mínima (P5). O nível pretendido já respeitava o piso, e a camada de verificação não aplicou restrição: o nível emitido foi 0,500. A decisão foi gravada ligada aos três eventos e, como o alvo mudou, o comando publicado foi:</w:t>
+        <w:lastRenderedPageBreak/>
+        <w:t>O ponto de luz da bancada corresponde ao poste de placa IP0412418, de classe P3, ligado aos trechos 20159, 21198 e 22661. Com volume nulo nos três, o nível observado foi 0, e a previsão para a próxima hora também. Sem ocorrência aberta, a inferência ativou com grau 1,0 apenas a regra de movimentação observada baixa e prevista baixa, o que resultou no degrau 2 e no nível pretendido de 0,500, a classe mínima (P5). O nível pretendido já respeitava o piso, e a camada de verificação não aplicou restrição: o nível emitido foi 0,500. A decisão foi gravada ligada aos três eventos e, como o alvo mudou, o comando publicado foi:</w:t>
       </w:r>
     </w:p>
     <w:p>
@@ -26069,19 +26088,7 @@
         <w:rPr>
           <w:lang w:val="pt-BR"/>
         </w:rPr>
-        <w:t xml:space="preserve">A leitura corresponde ao início da rampa, ainda no pleno: o nó só mede e publica ao receber um comando, e os passos seguintes ficam registrados na sua saída serial. Sem evento novo, o serviço não renovou o comando, que venceu 887 s depois, às 0 h 42 min 33 s, e o nó voltou ao pleno, </w:t>
-      </w:r>
-      <w:r>
-        <w:rPr>
-          <w:lang w:val="pt-BR"/>
-        </w:rPr>
-        <w:t xml:space="preserve">como exige o caso de teste CT18 (3.12.9). O exemplo é anterior à inclusão, na telemetria, do estado do nó antes do comando (3.13.2), e por isso a carga acima não o traz.</w:t>
-      </w:r>
-      <w:r>
-        <w:rPr>
-          <w:lang w:val="pt-BR"/>
-        </w:rPr>
-        <w:t xml:space="preserve"> A latência medida no nó de bancada é apresentada em 4.3.</w:t>
+        <w:t>A leitura corresponde ao início da rampa, ainda no pleno: o nó só mede e publica ao receber um comando, e os passos seguintes ficam registrados na sua saída serial. Sem evento novo, o serviço não renovou o comando, que venceu 887 s depois, às 0 h 42 min 33 s, e o nó voltou ao pleno, como exige o caso de teste CT18 (3.12.9). O exemplo é anterior à inclusão, na telemetria, do estado do nó antes do comando (3.13.2), e por isso a carga acima não o traz. A latência medida no nó de bancada é apresentada em 4.3.</w:t>
       </w:r>
     </w:p>
     <w:p>
@@ -26089,12 +26096,22 @@
         <w:spacing w:after="120" w:line="360" w:lineRule="auto"/>
         <w:ind w:firstLine="709"/>
         <w:jc w:val="both"/>
-      </w:pPr>
-      <w:r>
-        <w:rPr>
-          <w:lang w:val="pt-BR"/>
-        </w:rPr>
-        <w:t xml:space="preserve">As Figuras 5 e 6 mostram o passo (10) no painel de acompanhamento, com dados do ambiente implantado em 10 de outubro de 2026. Na visão de monitoramento (Figura 5), os cartões percorrem a cadeia de uma decisão — o volume recebido, o nível pretendido pela inferência, o nível emitido depois da verificação e a luz entregue, com o estado do nó antes do comando —, e o gráfico traz a trajetória dos níveis contra o piso da classe. Na visão de decisões explicadas (Figura 6), cada publicação recebida abre a explicação regra a regra: no exemplo, o volume nulo nos três trechos ativou as regras R5 e R7, e o nível pretendido de 0,625 foi emitido sem correção; como o alvo não mudou em relação à decisão anterior, não houve comando, e por isso a luz entregue aparece sem medição.</w:t>
+        <w:rPr>
+          <w:lang w:val="pt-BR"/>
+        </w:rPr>
+      </w:pPr>
+      <w:r>
+        <w:rPr>
+          <w:lang w:val="pt-BR"/>
+        </w:rPr>
+        <w:t xml:space="preserve">As Figuras 5 e 6 mostram o passo (10) no painel de acompanhamento, com dados do ambiente implantado em 10 de outubro de 2026. Na visão de monitoramento (Figura 5), os cartões percorrem a cadeia de uma decisão — o volume recebido, o nível pretendido pela inferência, o nível emitido depois da verificação e a luz entregue, com o estado do nó antes do comando —, e o gráfico traz a trajetória dos níveis contra o piso da classe. Na visão de decisões explicadas (Figura 6), cada publicação recebida abre a explicação regra a regra: no exemplo, o volume nulo nos três trechos ativou as regras R5 e R7, e o nível pretendido de 0,625 foi emitido sem correção; como </w:t>
+      </w:r>
+      <w:r>
+        <w:rPr>
+          <w:lang w:val="pt-BR"/>
+        </w:rPr>
+        <w:lastRenderedPageBreak/>
+        <w:t>o alvo não mudou em relação à decisão anterior, não houve comando, e por isso a luz entregue aparece sem medição.</w:t>
       </w:r>
     </w:p>
     <w:p>
@@ -26102,6 +26119,9 @@
         <w:keepNext/>
         <w:spacing w:before="130" w:after="60"/>
         <w:jc w:val="center"/>
+        <w:rPr>
+          <w:lang w:val="pt-BR"/>
+        </w:rPr>
       </w:pPr>
       <w:r>
         <w:rPr>
@@ -26109,7 +26129,7 @@
           <w:szCs w:val="20"/>
           <w:lang w:val="pt-BR"/>
         </w:rPr>
-        <w:t xml:space="preserve">Figura 5 – Painel de acompanhamento: visão de monitoramento</w:t>
+        <w:t>Figura 5 – Painel de acompanhamento: visão de monitoramento</w:t>
       </w:r>
     </w:p>
     <w:p>
@@ -26141,7 +26161,7 @@
                     <pic:cNvPicPr/>
                   </pic:nvPicPr>
                   <pic:blipFill>
-                    <a:blip r:embed="rIdCaptura107"/>
+                    <a:blip r:embed="rId12"/>
                     <a:stretch>
                       <a:fillRect/>
                     </a:stretch>
@@ -26166,6 +26186,9 @@
       <w:pPr>
         <w:spacing w:after="280"/>
         <w:jc w:val="center"/>
+        <w:rPr>
+          <w:lang w:val="pt-BR"/>
+        </w:rPr>
       </w:pPr>
       <w:r>
         <w:rPr>
@@ -26173,7 +26196,7 @@
           <w:szCs w:val="20"/>
           <w:lang w:val="pt-BR"/>
         </w:rPr>
-        <w:t xml:space="preserve">Fonte: Elaborado pelos autores (2026).</w:t>
+        <w:t>Fonte: Elaborado pelos autores (2026).</w:t>
       </w:r>
     </w:p>
     <w:p>
@@ -26181,6 +26204,9 @@
         <w:keepNext/>
         <w:spacing w:before="130" w:after="60"/>
         <w:jc w:val="center"/>
+        <w:rPr>
+          <w:lang w:val="pt-BR"/>
+        </w:rPr>
       </w:pPr>
       <w:r>
         <w:rPr>
@@ -26188,7 +26214,7 @@
           <w:szCs w:val="20"/>
           <w:lang w:val="pt-BR"/>
         </w:rPr>
-        <w:t xml:space="preserve">Figura 6 – Painel de acompanhamento: decisão explicada regra a regra</w:t>
+        <w:t>Figura 6 – Painel de acompanhamento: decisão explicada regra a regra</w:t>
       </w:r>
     </w:p>
     <w:p>
@@ -26220,7 +26246,7 @@
                     <pic:cNvPicPr/>
                   </pic:nvPicPr>
                   <pic:blipFill>
-                    <a:blip r:embed="rIdCaptura108"/>
+                    <a:blip r:embed="rId13"/>
                     <a:stretch>
                       <a:fillRect/>
                     </a:stretch>
@@ -26245,6 +26271,9 @@
       <w:pPr>
         <w:spacing w:after="280"/>
         <w:jc w:val="center"/>
+        <w:rPr>
+          <w:lang w:val="pt-BR"/>
+        </w:rPr>
       </w:pPr>
       <w:r>
         <w:rPr>
@@ -26252,7 +26281,7 @@
           <w:szCs w:val="20"/>
           <w:lang w:val="pt-BR"/>
         </w:rPr>
-        <w:t xml:space="preserve">Fonte: Elaborado pelos autores (2026).</w:t>
+        <w:t>Fonte: Elaborado pelos autores (2026).</w:t>
       </w:r>
     </w:p>
     <w:p>
@@ -26283,7 +26312,6 @@
       </w:pPr>
       <w:r>
         <w:rPr>
-          <w:highlight w:val="yellow"/>
           <w:lang w:val="pt-BR"/>
         </w:rPr>
         <w:t>O Quadro 15 especifica os casos de teste. Os casos CT01 a CT14 são automatizados e executados a cada alteração do código; os demais exigem o nó físico ou o ambiente implantado e compõem as etapas de 3.9.</w:t>
@@ -26300,6 +26328,7 @@
           <w:szCs w:val="20"/>
           <w:lang w:val="pt-BR"/>
         </w:rPr>
+        <w:lastRenderedPageBreak/>
         <w:t>Quadro 15 – Casos de teste</w:t>
       </w:r>
     </w:p>
@@ -26508,15 +26537,7 @@
                 <w:szCs w:val="20"/>
                 <w:lang w:val="pt-BR"/>
               </w:rPr>
-              <w:t xml:space="preserve">Publicação com campo fora do contrato, média negativa, volume com ocorrência, trecho fora do cadastro, pacote com item inválido </w:t>
-            </w:r>
-            <w:r>
-              <w:rPr>
-                <w:sz w:val="20"/>
-                <w:szCs w:val="20"/>
-                <w:lang w:val="pt-BR"/>
-              </w:rPr>
-              <w:t>ou sem chave de acesso</w:t>
+              <w:t>Publicação com campo fora do contrato, média negativa, volume com ocorrência, trecho fora do cadastro, pacote com item inválido ou sem chave de acesso</w:t>
             </w:r>
           </w:p>
         </w:tc>
@@ -27368,6 +27389,7 @@
                 <w:sz w:val="20"/>
                 <w:szCs w:val="20"/>
               </w:rPr>
+              <w:lastRenderedPageBreak/>
               <w:t>CT10</w:t>
             </w:r>
           </w:p>
@@ -28426,6 +28448,7 @@
         <w:rPr>
           <w:lang w:val="pt-BR"/>
         </w:rPr>
+        <w:lastRenderedPageBreak/>
         <w:t>3.12.8 Cronograma de atividades</w:t>
       </w:r>
       <w:bookmarkEnd w:id="54"/>
@@ -28486,13 +28509,24 @@
         <w:spacing w:after="120" w:line="360" w:lineRule="auto"/>
         <w:ind w:firstLine="709"/>
         <w:jc w:val="both"/>
+        <w:rPr>
+          <w:lang w:val="pt-BR"/>
+        </w:rPr>
       </w:pPr>
       <w:r>
         <w:rPr>
           <w:highlight w:val="yellow"/>
           <w:lang w:val="pt-BR"/>
         </w:rPr>
-        <w:t xml:space="preserve">Depois da sessão, a telemetria passou a levar também o estado do nó no instante em que o comando chega, antes de aplicá-lo (3.13.2), e a mudança foi verificada no mesmo dia, com o mesmo nó, depois de nova conferência e recalibração (sessão 115), exigidas porque a caixa havia sido deslocada. Publicado volume nulo nos três trechos do ponto, a decisão emitiu 0,625: o ensaio foi feito à tarde, quando o relógio do serviço trata o horário como início da noite, e a regra desse horário, que pede uma classe abaixo, ativou junto com a de movimentação baixa, o que resultou no degrau 1,5. Concluída a rampa, uma ocorrência de segurança levou o nível ao pleno, e a telemetria dessa decisão registrou o nível 1,000 e 9,96 lux, junto do estado anterior, de 0,625 e 6,23 lux, 0,3 % abaixo do esperado: o ponto em que a rampa terminou, que antes só ficava na saída serial do nó, ficou registrado no banco.</w:t>
+        <w:t xml:space="preserve">Depois da sessão, a telemetria passou a levar também o estado do nó no instante em que o comando chega, antes de aplicá-lo (3.13.2), e a mudança foi verificada no mesmo dia, com o mesmo nó, depois de nova conferência e recalibração (sessão 115), exigidas porque a caixa havia sido deslocada. Publicado volume nulo nos três trechos do ponto, a decisão emitiu 0,625: o ensaio foi feito à tarde, quando o relógio do serviço trata o horário como início da noite, e a regra desse horário, que pede uma classe abaixo, ativou junto com a de movimentação baixa, o que resultou no degrau 1,5. Concluída a rampa, uma ocorrência de segurança levou o nível ao pleno, e a telemetria dessa decisão registrou o nível 1,000 e 9,96 lux, junto do estado </w:t>
+      </w:r>
+      <w:r>
+        <w:rPr>
+          <w:highlight w:val="yellow"/>
+          <w:lang w:val="pt-BR"/>
+        </w:rPr>
+        <w:lastRenderedPageBreak/>
+        <w:t>anterior, de 0,625 e 6,23 lux, 0,3 % abaixo do esperado: o ponto em que a rampa terminou, que antes só ficava na saída serial do nó, ficou registrado no banco.</w:t>
       </w:r>
     </w:p>
     <w:p>
@@ -28558,13 +28592,7 @@
         <w:rPr>
           <w:lang w:val="pt-BR"/>
         </w:rPr>
-        <w:t xml:space="preserve">Adota-se modelo relacional, e a escolha decorre da natureza dos dados. O critério normativo aplicável a uma decisão depende da classe de iluminação da via em que o ponto de luz se encontra; reconstruir, para qualquer decisão passada, qual piso vigorava é uma operação de junção entre entidades, e não de varredura de documentos. A integridade referencial é, neste caso, o próprio mecanismo de </w:t>
-      </w:r>
-      <w:r>
-        <w:rPr>
-          <w:lang w:val="pt-BR"/>
-        </w:rPr>
-        <w:t>auditoria: uma decisão que não se ligue a um ponto de luz, a uma classe e a uma versão da base de regras é registro sem sentido, e o modelo relacional o impede por construção. O volume envolvido na avaliação em bancada é pequeno, e nenhuma característica de escala justificaria abrir mão dessa garantia.</w:t>
+        <w:t>Adota-se modelo relacional, e a escolha decorre da natureza dos dados. O critério normativo aplicável a uma decisão depende da classe de iluminação da via em que o ponto de luz se encontra; reconstruir, para qualquer decisão passada, qual piso vigorava é uma operação de junção entre entidades, e não de varredura de documentos. A integridade referencial é, neste caso, o próprio mecanismo de auditoria: uma decisão que não se ligue a um ponto de luz, a uma classe e a uma versão da base de regras é registro sem sentido, e o modelo relacional o impede por construção. O volume envolvido na avaliação em bancada é pequeno, e nenhuma característica de escala justificaria abrir mão dessa garantia.</w:t>
       </w:r>
     </w:p>
     <w:p>
@@ -28613,6 +28641,7 @@
           <w:szCs w:val="20"/>
           <w:lang w:val="pt-BR"/>
         </w:rPr>
+        <w:lastRenderedPageBreak/>
         <w:t>Quadro 16 – Entidades do banco de dados e sua função no sistema</w:t>
       </w:r>
     </w:p>
@@ -29335,15 +29364,7 @@
                 <w:szCs w:val="20"/>
                 <w:lang w:val="pt-BR"/>
               </w:rPr>
-              <w:t xml:space="preserve">Carimbo de tempo; ponto de luz; decisão correspondente; ciclo de trabalho aplicado; iluminância medida; </w:t>
-            </w:r>
-            <w:r>
-              <w:rPr>
-                <w:sz w:val="20"/>
-                <w:szCs w:val="20"/>
-                <w:lang w:val="pt-BR"/>
-              </w:rPr>
-              <w:t xml:space="preserve">nível que o nó aplicava ao responder; nível e iluminância antes do comando; sessão de medição</w:t>
+              <w:t>Carimbo de tempo; ponto de luz; decisão correspondente; ciclo de trabalho aplicado; iluminância medida; nível que o nó aplicava ao responder; nível e iluminância antes do comando; sessão de medição</w:t>
             </w:r>
           </w:p>
         </w:tc>
@@ -29392,6 +29413,7 @@
                 <w:sz w:val="20"/>
                 <w:szCs w:val="20"/>
               </w:rPr>
+              <w:lastRenderedPageBreak/>
               <w:t>versao_modelo_previsao</w:t>
             </w:r>
             <w:proofErr w:type="spellEnd"/>
@@ -29909,19 +29931,7 @@
         <w:rPr>
           <w:lang w:val="pt-BR"/>
         </w:rPr>
-        <w:t xml:space="preserve">A </w:t>
-      </w:r>
-      <w:r>
-        <w:rPr>
-          <w:lang w:val="pt-BR"/>
-        </w:rPr>
-        <w:t xml:space="preserve">Figura 7</w:t>
-      </w:r>
-      <w:r>
-        <w:rPr>
-          <w:lang w:val="pt-BR"/>
-        </w:rPr>
-        <w:t xml:space="preserve"> apresenta o modelo de dados em nível de relacionamento. A justificativa da escolha pelo modelo relacional e a função de cada entidade estão registradas em 3.13.1 e no Quadro 16; o que a figura acrescenta são as cardinalidades e uma entidade que aquele quadro não discrimina.</w:t>
+        <w:t>A Figura 7 apresenta o modelo de dados em nível de relacionamento. A justificativa da escolha pelo modelo relacional e a função de cada entidade estão registradas em 3.13.1 e no Quadro 16; o que a figura acrescenta são as cardinalidades e uma entidade que aquele quadro não discrimina.</w:t>
       </w:r>
     </w:p>
     <w:p>
@@ -29939,15 +29949,8 @@
           <w:szCs w:val="20"/>
           <w:lang w:val="pt-BR"/>
         </w:rPr>
-        <w:t xml:space="preserve">Figura 7</w:t>
-      </w:r>
-      <w:r>
-        <w:rPr>
-          <w:sz w:val="20"/>
-          <w:szCs w:val="20"/>
-          <w:lang w:val="pt-BR"/>
-        </w:rPr>
-        <w:t xml:space="preserve"> – Diagrama entidade-relacionamento do banco de dados</w:t>
+        <w:lastRenderedPageBreak/>
+        <w:t>Figura 7 – Diagrama entidade-relacionamento do banco de dados</w:t>
       </w:r>
     </w:p>
     <w:p>
@@ -29980,7 +29983,7 @@
                     <pic:cNvPicPr/>
                   </pic:nvPicPr>
                   <pic:blipFill>
-                    <a:blip r:embed="rId10"/>
+                    <a:blip r:embed="rId14"/>
                     <a:stretch>
                       <a:fillRect/>
                     </a:stretch>
@@ -30047,19 +30050,14 @@
         <w:rPr>
           <w:lang w:val="pt-BR"/>
         </w:rPr>
-        <w:t xml:space="preserve">Duas cardinalidades merecem nota. A relação entre decisão e telemetria é de um para no máximo um: cada comando emitido produz uma leitura de confirmação, e a decisão que mantém o alvo e não gera comando não tem telemetria; leituras periódicas do sensor que não correspondam a comando não constituem telemetria de decisão e </w:t>
-      </w:r>
-      <w:r>
-        <w:rPr>
-          <w:lang w:val="pt-BR"/>
-        </w:rPr>
-        <w:t xml:space="preserve">não são registradas nessa entidade. Como a leitura é feita logo depois de aplicado o comando, a telemetria registra também o estado do nó no instante em que o comando chegou: é por ela que o ponto em que terminou a rampa anterior — o piso, por exemplo — fica no banco, ainda que só com o comando seguinte.</w:t>
-      </w:r>
-      <w:r>
-        <w:rPr>
-          <w:lang w:val="pt-BR"/>
-        </w:rPr>
-        <w:t xml:space="preserve"> A relação entre classe de iluminação e ponto de luz, por sua vez, é o que permite recuperar por junção o critério normativo aplicável a qualquer decisão passada, mesmo após reclassificação da via — desde que a reclassificação seja registrada como dado novo, e não como alteração do registro existente. Para que a garantia não dependa dessa disciplina, a decisão carrega também a classe vigente no momento em que foi tomada: a junção com a classe serve para recuperar os limites daquela classe, e não para descobrir qual classe valia.</w:t>
+        <w:t xml:space="preserve">Duas cardinalidades merecem nota. A relação entre decisão e telemetria é de um para no máximo um: cada comando emitido produz uma leitura de confirmação, e a decisão que mantém o alvo e não gera comando não tem telemetria; leituras periódicas do sensor que não correspondam a comando não constituem telemetria de </w:t>
+      </w:r>
+      <w:r>
+        <w:rPr>
+          <w:lang w:val="pt-BR"/>
+        </w:rPr>
+        <w:lastRenderedPageBreak/>
+        <w:t>decisão e não são registradas nessa entidade. Como a leitura é feita logo depois de aplicado o comando, a telemetria registra também o estado do nó no instante em que o comando chegou: é por ela que o ponto em que terminou a rampa anterior — o piso, por exemplo — fica no banco, ainda que só com o comando seguinte. A relação entre classe de iluminação e ponto de luz, por sua vez, é o que permite recuperar por junção o critério normativo aplicável a qualquer decisão passada, mesmo após reclassificação da via — desde que a reclassificação seja registrada como dado novo, e não como alteração do registro existente. Para que a garantia não dependa dessa disciplina, a decisão carrega também a classe vigente no momento em que foi tomada: a junção com a classe serve para recuperar os limites daquela classe, e não para descobrir qual classe valia.</w:t>
       </w:r>
     </w:p>
     <w:p>
@@ -30401,7 +30399,16 @@
                 <w:szCs w:val="20"/>
                 <w:lang w:val="pt-BR"/>
               </w:rPr>
-              <w:t>Identificador; código único; placa do cadastro, única; logradouro; coordenadas geográficas e planas; classe, chave estrangeira; estado operacional em {operante, falha, manutenção, sem comunicação}; potência plena do segmento, positiva</w:t>
+              <w:t xml:space="preserve">Identificador; código único; placa do cadastro, única; logradouro; coordenadas geográficas e planas; classe, chave estrangeira; estado </w:t>
+            </w:r>
+            <w:r>
+              <w:rPr>
+                <w:sz w:val="20"/>
+                <w:szCs w:val="20"/>
+                <w:lang w:val="pt-BR"/>
+              </w:rPr>
+              <w:lastRenderedPageBreak/>
+              <w:t>operacional em {operante, falha, manutenção, sem comunicação}; potência plena do segmento, positiva</w:t>
             </w:r>
           </w:p>
         </w:tc>
@@ -30427,6 +30434,7 @@
                 <w:szCs w:val="20"/>
                 <w:lang w:val="pt-BR"/>
               </w:rPr>
+              <w:lastRenderedPageBreak/>
               <w:t>Ponto comandado; o estado é atualizado pela presença do nó e pelo diagnóstico</w:t>
             </w:r>
           </w:p>
@@ -30982,6 +30990,7 @@
                 <w:sz w:val="20"/>
                 <w:szCs w:val="20"/>
               </w:rPr>
+              <w:lastRenderedPageBreak/>
               <w:t>decisao</w:t>
             </w:r>
             <w:proofErr w:type="spellEnd"/>
@@ -31237,15 +31246,7 @@
                 <w:szCs w:val="20"/>
                 <w:lang w:val="pt-BR"/>
               </w:rPr>
-              <w:t xml:space="preserve">Identificador; decisão, única; ponto; sessão; instantes de medição e de recebimento; ciclo de trabalho entre 0 e 1; iluminância não negativa; </w:t>
-            </w:r>
-            <w:r>
-              <w:rPr>
-                <w:sz w:val="20"/>
-                <w:szCs w:val="20"/>
-                <w:lang w:val="pt-BR"/>
-              </w:rPr>
-              <w:t xml:space="preserve">nível aplicado entre 0 e 1; nível antes do comando entre 0 e 1 e iluminância antes do comando não negativa, ambos opcionais</w:t>
+              <w:t>Identificador; decisão, única; ponto; sessão; instantes de medição e de recebimento; ciclo de trabalho entre 0 e 1; iluminância não negativa; nível aplicado entre 0 e 1; nível antes do comando entre 0 e 1 e iluminância antes do comando não negativa, ambos opcionais</w:t>
             </w:r>
           </w:p>
         </w:tc>
@@ -31485,6 +31486,7 @@
         <w:rPr>
           <w:lang w:val="pt-BR"/>
         </w:rPr>
+        <w:lastRenderedPageBreak/>
         <w:t>4 RESULTADOS</w:t>
       </w:r>
       <w:bookmarkEnd w:id="60"/>
@@ -31571,6 +31573,7 @@
           <w:highlight w:val="yellow"/>
           <w:lang w:val="pt-BR"/>
         </w:rPr>
+        <w:lastRenderedPageBreak/>
         <w:t>Com a série horária de Melbourne, empregada antes da troca (3.6), o modelo havia apresentado erro absoluto médio de 0,047, contra 0,057 da média sazonal, e era equivalente à floresta aleatória, com diferença de 0,5 %. O experimento que motivou a troca, com 14 pontos de Zurique, 12 deles com dados no ano de teste, está no Tabela 4, em 4.6: na resolução de 15 min, o modelo supera a melhor referência simples pelas margens fixadas; com os mesmos dados somados por hora, não.</w:t>
       </w:r>
     </w:p>
@@ -31656,6 +31659,7 @@
           <w:highlight w:val="yellow"/>
           <w:lang w:val="pt-BR"/>
         </w:rPr>
+        <w:lastRenderedPageBreak/>
         <w:t>A medição exigiu duas execuções, ambas registradas. Na primeira, a ocorrência curta publicada antes das repetições para medir a diferença entre os relógios venceu pelo prazo e, sem evento que o reconhecesse, manteve o alvo no pleno; a primeira repetição não mudou o alvo nem gerou comando, e a execução foi interrompida. É a limitação declarada em 5.3 para a ocorrência encerrada por prazo, e o procedimento passou a publicar o encerramento explícito. A diferença entre os relógios, de 1,3 s, foi corrigida nos instantes publicados: o serviço desconsidera publicação com instante posterior ao do seu relógio, e a resposta imediata pressupõe relógios sincronizados entre a plataforma e o serviço.</w:t>
       </w:r>
     </w:p>
@@ -31729,6 +31733,7 @@
         <w:rPr>
           <w:lang w:val="pt-BR"/>
         </w:rPr>
+        <w:lastRenderedPageBreak/>
         <w:t>iluminação pudesse consumi-la, onde, quando e como, com a justificativa de cada requisito.</w:t>
       </w:r>
     </w:p>
@@ -32647,6 +32652,7 @@
                 <w:sz w:val="20"/>
                 <w:szCs w:val="20"/>
               </w:rPr>
+              <w:lastRenderedPageBreak/>
               <w:t>Madrugada</w:t>
             </w:r>
             <w:proofErr w:type="spellEnd"/>
@@ -33445,6 +33451,7 @@
           <w:highlight w:val="yellow"/>
           <w:lang w:val="pt-BR"/>
         </w:rPr>
+        <w:lastRenderedPageBreak/>
         <w:t>regime. Os valores decorrem do registro de decisões, pela fórmula de 3.11, e não constituem medição elétrica.</w:t>
       </w:r>
     </w:p>
@@ -34188,6 +34195,7 @@
         <w:rPr>
           <w:lang w:val="pt-BR"/>
         </w:rPr>
+        <w:lastRenderedPageBreak/>
         <w:t>taxa foi zero. O Tabela 3 reúne o que se mediu ao retirar ou substituir cada componente no sistema; onde há dois valores, o primeiro é o do componente e o segundo, o da alternativa.</w:t>
       </w:r>
     </w:p>
@@ -34893,6 +34901,7 @@
                 <w:szCs w:val="20"/>
                 <w:lang w:val="pt-BR"/>
               </w:rPr>
+              <w:lastRenderedPageBreak/>
               <w:t>Inferência nebulosa × tabela em degraus × tabela com histerese de descida</w:t>
             </w:r>
           </w:p>
@@ -35232,6 +35241,7 @@
                 <w:sz w:val="20"/>
                 <w:szCs w:val="20"/>
               </w:rPr>
+              <w:lastRenderedPageBreak/>
               <w:t>Acerto</w:t>
             </w:r>
             <w:proofErr w:type="spellEnd"/>
@@ -35603,6 +35613,7 @@
         <w:rPr>
           <w:lang w:val="pt-BR"/>
         </w:rPr>
+        <w:lastRenderedPageBreak/>
         <w:t>5 ANÁLISE DOS RESULTADOS</w:t>
       </w:r>
       <w:bookmarkEnd w:id="67"/>
@@ -35782,6 +35793,7 @@
         <w:rPr>
           <w:lang w:val="pt-BR"/>
         </w:rPr>
+        <w:lastRenderedPageBreak/>
         <w:t>O protótipo é um nó único, em escala reduzida e em baixa tensão de corrente contínua, não reproduzindo a potência, a altura de montagem nem a geometria fotométrica de uma luminária viária real. O que se transpõe é a arquitetura e o procedimento, não os valores medidos.</w:t>
       </w:r>
     </w:p>
@@ -35888,6 +35900,7 @@
         <w:rPr>
           <w:lang w:val="pt-BR"/>
         </w:rPr>
+        <w:lastRenderedPageBreak/>
         <w:t>Os sensores da bancada não têm calibração rastreável a padrão metrológico e a cadeia de medição é única, sem verificação cruzada contra instrumento de referência. O trabalho afirma repetibilidade, monotonicidade e consistência interna da escala, e não exatidão absoluta em iluminância, nos termos de 3.4.4.</w:t>
       </w:r>
     </w:p>
@@ -35994,6 +36007,7 @@
         <w:rPr>
           <w:lang w:val="pt-BR"/>
         </w:rPr>
+        <w:lastRenderedPageBreak/>
         <w:t>registrada, supõe proporcionalidade entre ciclo e potência e despreza a eficiência variável do regulador de corrente e o consumo fixo do módulo de telegestão — hipóteses que a tornam um limite superior otimista quando transposta a equipamento viário, nos termos de 3.11. A projeção para o parque adota luminária de referência derivada dos parâmetros contratuais, e não modelo comercial identificado, informação que não é divulgada. Não se afirma economia anual, em escala de parque, nem valor monetário. A quantificação com medição elétrica rastreável figura entre as recomendações de 6.1.</w:t>
       </w:r>
     </w:p>
@@ -36120,6 +36134,7 @@
         <w:rPr>
           <w:lang w:val="pt-BR"/>
         </w:rPr>
+        <w:lastRenderedPageBreak/>
         <w:t>ele; o tratamento desses casos figura na especificação de integração como requisito à plataforma, e não como resultado medido.</w:t>
       </w:r>
     </w:p>
@@ -36280,6 +36295,7 @@
         <w:rPr>
           <w:lang w:val="pt-BR"/>
         </w:rPr>
+        <w:lastRenderedPageBreak/>
         <w:t>Não houve teste de carga na escala do parque: a estimativa de cerca de 170 publicações por segundo para 50 mil câmeras é cálculo, e não medição.</w:t>
       </w:r>
     </w:p>
@@ -36380,6 +36396,7 @@
         <w:rPr>
           <w:lang w:val="pt-BR"/>
         </w:rPr>
+        <w:lastRenderedPageBreak/>
         <w:t>A avaliação dos componentes apoia-se em oito noites reais de uma série de 15 min, em que o volume de 5 min repete o valor do bloco, e em pares sintéticos de falha de contagem. O déficit em relação ao nível pedido adota o critério dos tercis, que é dos autores. Uma série de contagem por minuto, que permitiria avaliar o período de 5 min da interface, está sendo reunida a partir da publicação diária de Melbourne, e não compõe os resultados desta versão.</w:t>
       </w:r>
     </w:p>
@@ -36471,6 +36488,7 @@
         <w:rPr>
           <w:lang w:val="pt-BR"/>
         </w:rPr>
+        <w:lastRenderedPageBreak/>
         <w:t>6 CONCLUSÕES</w:t>
       </w:r>
       <w:bookmarkEnd w:id="72"/>
@@ -36702,6 +36720,7 @@
         <w:rPr>
           <w:lang w:val="pt-BR"/>
         </w:rPr>
+        <w:lastRenderedPageBreak/>
         <w:t>Treinar e operar a camada de previsão com série no período de publicação da interface, de 5 min, e avaliar o efeito no ciclo completo de decisão (3.6, 4.6 e 5.3).</w:t>
       </w:r>
     </w:p>
@@ -36780,6 +36799,7 @@
         <w:rPr>
           <w:lang w:val="pt-BR"/>
         </w:rPr>
+        <w:lastRenderedPageBreak/>
         <w:t>REFERÊNCIAS</w:t>
       </w:r>
       <w:bookmarkEnd w:id="74"/>
@@ -37074,6 +37094,7 @@
         <w:rPr>
           <w:lang w:val="pt-BR"/>
         </w:rPr>
+        <w:lastRenderedPageBreak/>
         <w:t>https://www.planalto.gov.br/ccivil_03/_ato2015-2018/2018/lei/l13709.htm. Acesso em: 13 set. 2026.</w:t>
       </w:r>
     </w:p>
@@ -37388,6 +37409,7 @@
         <w:rPr>
           <w:lang w:val="pt-BR"/>
         </w:rPr>
+        <w:lastRenderedPageBreak/>
         <w:t xml:space="preserve">INSTITUTO NACIONAL DE METROLOGIA, QUALIDADE E TECNOLOGIA. </w:t>
       </w:r>
       <w:r>
@@ -37631,6 +37653,7 @@
         <w:spacing w:after="240"/>
       </w:pPr>
       <w:r>
+        <w:lastRenderedPageBreak/>
         <w:t xml:space="preserve">PERRY, Tekla S. Cops tap smart streetlights, sparking controversy and legislation. </w:t>
       </w:r>
       <w:r>
@@ -37899,6 +37922,7 @@
         <w:rPr>
           <w:lang w:val="pt-BR"/>
         </w:rPr>
+        <w:lastRenderedPageBreak/>
         <w:t>Paulo: Prefeitura do Município de São Paulo, 8 out. 2021. Disponível em: https://prefeitura.sp.gov.br/w/noticia/prefeitura-avanca-na-modernizacao-com-led-da-rede-de-iluminacao-publica-de-sao-paulo. Acesso em: 13 set. 2026.</w:t>
       </w:r>
     </w:p>
@@ -38080,6 +38104,7 @@
         <w:spacing w:after="240"/>
       </w:pPr>
       <w:r>
+        <w:lastRenderedPageBreak/>
         <w:t>SHIKAKURA, Tomoaki; MORIKAWA, Hiroyuki; NAKAMURA, Yoshiki. Perception of lighting fluctuation in office lighting environment. Journal of Light &amp; Visual Environment, v. 27, n. 2, p. 75-82, 2003. DOI: 10.2150/jlve.27.75.</w:t>
       </w:r>
     </w:p>
@@ -38236,6 +38261,7 @@
         <w:rPr>
           <w:lang w:val="pt-BR"/>
         </w:rPr>
+        <w:lastRenderedPageBreak/>
         <w:t>APÊNDICE A — DECLARAÇÃO DE USO DE FERRAMENTAS DE INTELIGÊNCIA ARTIFICIAL GENERATIVA</w:t>
       </w:r>
       <w:bookmarkEnd w:id="75"/>
@@ -38442,6 +38468,7 @@
           <w:szCs w:val="20"/>
           <w:lang w:val="pt-BR"/>
         </w:rPr>
+        <w:lastRenderedPageBreak/>
         <w:t>Quadro 19 – Matriz de emprego técnico de inteligência artificial</w:t>
       </w:r>
     </w:p>
@@ -38887,14 +38914,12 @@
             </w:tcMar>
           </w:tcPr>
           <w:p>
-            <w:proofErr w:type="spellStart"/>
-            <w:proofErr w:type="spellEnd"/>
-            <w:r>
-              <w:rPr>
-                <w:sz w:val="20"/>
-                <w:szCs w:val="20"/>
-              </w:rPr>
-              <w:t xml:space="preserve">Figuras 3, 4 e 7</w:t>
+            <w:r>
+              <w:rPr>
+                <w:sz w:val="20"/>
+                <w:szCs w:val="20"/>
+              </w:rPr>
+              <w:t>Figuras 3, 4 e 7</w:t>
             </w:r>
           </w:p>
         </w:tc>
@@ -39538,6 +39563,7 @@
                 <w:szCs w:val="20"/>
                 <w:lang w:val="pt-BR"/>
               </w:rPr>
+              <w:lastRenderedPageBreak/>
               <w:t>aprovados pelos autores antes de cada execução; busca e conferência de qualidade dos conjuntos de dados públicos</w:t>
             </w:r>
           </w:p>
@@ -39558,6 +39584,7 @@
                 <w:sz w:val="20"/>
                 <w:szCs w:val="20"/>
               </w:rPr>
+              <w:lastRenderedPageBreak/>
               <w:t>40</w:t>
             </w:r>
           </w:p>
@@ -39592,19 +39619,7 @@
         <w:rPr>
           <w:lang w:val="pt-BR"/>
         </w:rPr>
-        <w:t xml:space="preserve">Ambiente de acesso e janela temporal de interação. As requisições aos modelos Claude Opus 5 e Claude Opus 5.5 foram executadas pela interface do aplicativo Claude, com execução de código em ambiente isolado fornecido pela própria ferramenta, e pela ferramenta Claude Code, com execução de código no computador dos autores, </w:t>
-      </w:r>
-      <w:r>
-        <w:rPr>
-          <w:lang w:val="pt-BR"/>
-        </w:rPr>
-        <w:t xml:space="preserve">no período de 13/09/2026</w:t>
-      </w:r>
-      <w:r>
-        <w:rPr>
-          <w:lang w:val="pt-BR"/>
-        </w:rPr>
-        <w:t xml:space="preserve"> a ___/___/2026. </w:t>
+        <w:t xml:space="preserve">Ambiente de acesso e janela temporal de interação. As requisições aos modelos Claude Opus 5 e Claude Opus 5.5 foram executadas pela interface do aplicativo Claude, com execução de código em ambiente isolado fornecido pela própria ferramenta, e pela ferramenta Claude Code, com execução de código no computador dos autores, no período de 13/09/2026 a ___/___/2026. </w:t>
       </w:r>
     </w:p>
     <w:p>
@@ -39717,6 +39732,7 @@
         <w:rPr>
           <w:lang w:val="pt-BR"/>
         </w:rPr>
+        <w:lastRenderedPageBreak/>
         <w:t>2. O corpo teórico, a análise crítica, a inferência empírica e as conclusões apresentadas representam o esforço intelectual dos autores humanos, a quem cabe a decisão sobre cada afirmação sustentada no texto.</w:t>
       </w:r>
     </w:p>
@@ -39930,6 +39946,7 @@
         <w:rPr>
           <w:lang w:val="pt-BR"/>
         </w:rPr>
+        <w:lastRenderedPageBreak/>
         <w:t>APÊNDICE B — REPRODUTIBILIDADE DOS RESULTADOS</w:t>
       </w:r>
       <w:bookmarkEnd w:id="76"/>
@@ -40239,7 +40256,16 @@
                 <w:szCs w:val="20"/>
                 <w:lang w:val="pt-BR"/>
               </w:rPr>
-              <w:t>modelo/PROTOCOLO_COMPARACAO_MODELOS.md e modelo/comparar_modelos.py; modelo/baixar_dados.py e modelo/treinar.py; série de Melbourne extraída em 23/09/2026</w:t>
+              <w:t xml:space="preserve">modelo/PROTOCOLO_COMPARACAO_MODELOS.md e modelo/comparar_modelos.py; modelo/baixar_dados.py e </w:t>
+            </w:r>
+            <w:r>
+              <w:rPr>
+                <w:sz w:val="20"/>
+                <w:szCs w:val="20"/>
+                <w:lang w:val="pt-BR"/>
+              </w:rPr>
+              <w:lastRenderedPageBreak/>
+              <w:t>modelo/treinar.py; série de Melbourne extraída em 23/09/2026</w:t>
             </w:r>
           </w:p>
         </w:tc>
@@ -40265,6 +40291,7 @@
                 <w:szCs w:val="20"/>
                 <w:lang w:val="pt-BR"/>
               </w:rPr>
+              <w:lastRenderedPageBreak/>
               <w:t>python -m modelo.comparar_modelos. Resultado em modelo/resultados/comparacao_modelos.json. Protocolo f6d306c; resultado 7ad1b3c</w:t>
             </w:r>
           </w:p>
@@ -40985,7 +41012,16 @@
                 <w:szCs w:val="20"/>
                 <w:lang w:val="pt-BR"/>
               </w:rPr>
-              <w:t>bancada/sessao_ct.py e bancada/ROTEIRO_SESSAO_CT15_CT20.md; nó de bancada e simulado ligados ao ambiente implantado</w:t>
+              <w:t xml:space="preserve">bancada/sessao_ct.py e bancada/ROTEIRO_SESSAO_CT15_CT20.md; nó de </w:t>
+            </w:r>
+            <w:r>
+              <w:rPr>
+                <w:sz w:val="20"/>
+                <w:szCs w:val="20"/>
+                <w:lang w:val="pt-BR"/>
+              </w:rPr>
+              <w:lastRenderedPageBreak/>
+              <w:t>bancada e simulado ligados ao ambiente implantado</w:t>
             </w:r>
           </w:p>
         </w:tc>
@@ -41006,7 +41042,17 @@
                 <w:szCs w:val="20"/>
                 <w:lang w:val="pt-BR"/>
               </w:rPr>
-              <w:t>python -m bancada.sessao_ct latencia, piso e credencial; CT16 com comandos provocados e python -m bancada.sessao_ct alertas; CT18 com o registro da porta serial. Registros em bancada/resultados/ct*_20261010*. Versões 1d7b3f7 e 396076b</w:t>
+              <w:lastRenderedPageBreak/>
+              <w:t xml:space="preserve">python -m bancada.sessao_ct latencia, piso e credencial; CT16 com comandos provocados e python -m bancada.sessao_ct </w:t>
+            </w:r>
+            <w:r>
+              <w:rPr>
+                <w:sz w:val="20"/>
+                <w:szCs w:val="20"/>
+                <w:lang w:val="pt-BR"/>
+              </w:rPr>
+              <w:lastRenderedPageBreak/>
+              <w:t>alertas; CT18 com o registro da porta serial. Registros em bancada/resultados/ct*_20261010*. Versões 1d7b3f7 e 396076b</w:t>
             </w:r>
           </w:p>
         </w:tc>
@@ -41034,6 +41080,7 @@
                 <w:szCs w:val="20"/>
                 <w:lang w:val="pt-BR"/>
               </w:rPr>
+              <w:lastRenderedPageBreak/>
               <w:t>4.5 — energia do nó de bancada</w:t>
             </w:r>
           </w:p>
@@ -41092,7 +41139,6 @@
         </w:tc>
       </w:tr>
       <w:tr>
-        <w:trPr/>
         <w:tc>
           <w:tcPr>
             <w:tcW w:w="1900" w:type="dxa"/>
@@ -41104,14 +41150,18 @@
             </w:tcMar>
           </w:tcPr>
           <w:p>
-            <w:pPr/>
-            <w:r>
-              <w:rPr>
-                <w:sz w:val="20"/>
-                <w:szCs w:val="20"/>
-                <w:lang w:val="pt-BR"/>
-              </w:rPr>
-              <w:t xml:space="preserve">3.12.9 — estado do nó antes do comando</w:t>
+            <w:pPr>
+              <w:rPr>
+                <w:lang w:val="pt-BR"/>
+              </w:rPr>
+            </w:pPr>
+            <w:r>
+              <w:rPr>
+                <w:sz w:val="20"/>
+                <w:szCs w:val="20"/>
+                <w:lang w:val="pt-BR"/>
+              </w:rPr>
+              <w:t>3.12.9 — estado do nó antes do comando</w:t>
             </w:r>
           </w:p>
         </w:tc>
@@ -41126,14 +41176,18 @@
             </w:tcMar>
           </w:tcPr>
           <w:p>
-            <w:pPr/>
-            <w:r>
-              <w:rPr>
-                <w:sz w:val="20"/>
-                <w:szCs w:val="20"/>
-                <w:lang w:val="pt-BR"/>
-              </w:rPr>
-              <w:t xml:space="preserve">bancada/teste_estado_antes.py; nó de bancada ligado ao ambiente implantado</w:t>
+            <w:pPr>
+              <w:rPr>
+                <w:lang w:val="pt-BR"/>
+              </w:rPr>
+            </w:pPr>
+            <w:r>
+              <w:rPr>
+                <w:sz w:val="20"/>
+                <w:szCs w:val="20"/>
+                <w:lang w:val="pt-BR"/>
+              </w:rPr>
+              <w:t>bancada/teste_estado_antes.py; nó de bancada ligado ao ambiente implantado</w:t>
             </w:r>
           </w:p>
         </w:tc>
@@ -41148,22 +41202,18 @@
             </w:tcMar>
           </w:tcPr>
           <w:p>
-            <w:pPr/>
-            <w:r>
-              <w:rPr>
-                <w:sz w:val="20"/>
-                <w:szCs w:val="20"/>
-                <w:lang w:val="pt-BR"/>
-              </w:rPr>
-              <w:t xml:space="preserve">python -m bancada.teste_estado_antes. Registro em bancada/resultados/estado_antes_20261010.json. </w:t>
-            </w:r>
-            <w:r>
-              <w:rPr>
-                <w:sz w:val="20"/>
-                <w:szCs w:val="20"/>
-                <w:lang w:val="pt-BR"/>
-              </w:rPr>
-              <w:t xml:space="preserve">Versão a03a21f</w:t>
+            <w:pPr>
+              <w:rPr>
+                <w:lang w:val="pt-BR"/>
+              </w:rPr>
+            </w:pPr>
+            <w:r>
+              <w:rPr>
+                <w:sz w:val="20"/>
+                <w:szCs w:val="20"/>
+                <w:lang w:val="pt-BR"/>
+              </w:rPr>
+              <w:t>python -m bancada.teste_estado_antes. Registro em bancada/resultados/estado_antes_20261010.json. Versão a03a21f</w:t>
             </w:r>
           </w:p>
         </w:tc>
@@ -41172,6 +41222,9 @@
     <w:p>
       <w:pPr>
         <w:spacing w:before="130" w:after="260"/>
+        <w:rPr>
+          <w:lang w:val="pt-BR"/>
+        </w:rPr>
       </w:pPr>
       <w:r>
         <w:rPr>
@@ -41195,12 +41248,16 @@
         <w:pageBreakBefore/>
         <w:spacing w:before="480" w:after="280" w:line="360" w:lineRule="auto"/>
         <w:jc w:val="center"/>
-      </w:pPr>
-      <w:r>
-        <w:rPr>
-          <w:lang w:val="pt-BR"/>
-        </w:rPr>
-        <w:t xml:space="preserve">APÊNDICE C — REGISTRO FOTOGRÁFICO DO NÓ DE BANCADA</w:t>
+        <w:rPr>
+          <w:lang w:val="pt-BR"/>
+        </w:rPr>
+      </w:pPr>
+      <w:r>
+        <w:rPr>
+          <w:lang w:val="pt-BR"/>
+        </w:rPr>
+        <w:lastRenderedPageBreak/>
+        <w:t>APÊNDICE C — REGISTRO FOTOGRÁFICO DO NÓ DE BANCADA</w:t>
       </w:r>
     </w:p>
     <w:p>
@@ -41208,24 +41265,15 @@
         <w:spacing w:after="120" w:line="360" w:lineRule="auto"/>
         <w:ind w:firstLine="709"/>
         <w:jc w:val="both"/>
-      </w:pPr>
-      <w:r>
-        <w:rPr>
-          <w:lang w:val="pt-BR"/>
-        </w:rPr>
-        <w:t xml:space="preserve">A </w:t>
-      </w:r>
-      <w:r>
-        <w:rPr>
-          <w:lang w:val="pt-BR"/>
-        </w:rPr>
-        <w:t xml:space="preserve">Figura 8</w:t>
-      </w:r>
-      <w:r>
-        <w:rPr>
-          <w:lang w:val="pt-BR"/>
-        </w:rPr>
-        <w:t xml:space="preserve"> complementa as Figuras 1 e 2 com a vista posterior do nó de demonstração, em que aparecem a passagem do cabo de alimentação da fita pela parede do anteparo e a posição do sensor na face oposta.</w:t>
+        <w:rPr>
+          <w:lang w:val="pt-BR"/>
+        </w:rPr>
+      </w:pPr>
+      <w:r>
+        <w:rPr>
+          <w:lang w:val="pt-BR"/>
+        </w:rPr>
+        <w:t>A Figura 8 complementa as Figuras 1 e 2 com a vista posterior do nó de demonstração, em que aparecem a passagem do cabo de alimentação da fita pela parede do anteparo e a posição do sensor na face oposta.</w:t>
       </w:r>
     </w:p>
     <w:p>
@@ -41233,6 +41281,9 @@
         <w:keepNext/>
         <w:spacing w:before="130" w:after="60"/>
         <w:jc w:val="center"/>
+        <w:rPr>
+          <w:lang w:val="pt-BR"/>
+        </w:rPr>
       </w:pPr>
       <w:r>
         <w:rPr>
@@ -41240,15 +41291,7 @@
           <w:szCs w:val="20"/>
           <w:lang w:val="pt-BR"/>
         </w:rPr>
-        <w:t xml:space="preserve">Figura 8</w:t>
-      </w:r>
-      <w:r>
-        <w:rPr>
-          <w:sz w:val="20"/>
-          <w:szCs w:val="20"/>
-          <w:lang w:val="pt-BR"/>
-        </w:rPr>
-        <w:t xml:space="preserve"> – Vista posterior do nó de demonstração</w:t>
+        <w:t>Figura 8 – Vista posterior do nó de demonstração</w:t>
       </w:r>
     </w:p>
     <w:p>
@@ -41280,7 +41323,7 @@
                     <pic:cNvPicPr/>
                   </pic:nvPicPr>
                   <pic:blipFill>
-                    <a:blip r:embed="rIdFoto106"/>
+                    <a:blip r:embed="rId15"/>
                     <a:stretch>
                       <a:fillRect/>
                     </a:stretch>
@@ -41312,11 +41355,11 @@
           <w:szCs w:val="20"/>
           <w:lang w:val="pt-BR"/>
         </w:rPr>
-        <w:t xml:space="preserve">Fonte: Acervo dos autores (2026).</w:t>
+        <w:t>Fonte: Acervo dos autores (2026).</w:t>
       </w:r>
     </w:p>
     <w:sectPr>
-      <w:headerReference w:type="default" r:id="rId11"/>
+      <w:headerReference w:type="default" r:id="rId16"/>
       <w:pgSz w:w="11906" w:h="16838"/>
       <w:pgMar w:top="1701" w:right="1134" w:bottom="1134" w:left="1701" w:header="1134" w:footer="708" w:gutter="0"/>
       <w:pgNumType w:start="9"/>

</xml_diff>